<commit_message>
To Show Raised and Pending Status Successfully in Touble Ticket Table
</commit_message>
<xml_diff>
--- a/document/Trouble Ticket Overview/TT Dashboard Integration.docx
+++ b/document/Trouble Ticket Overview/TT Dashboard Integration.docx
@@ -62,6 +62,9 @@
     <w:p/>
     <w:p>
       <w:r>
+        <w:rPr>
+          <w:noProof/>
+        </w:rPr>
         <w:drawing>
           <wp:inline distT="0" distB="0" distL="0" distR="0" wp14:anchorId="32DB0B78" wp14:editId="5A295D5A">
             <wp:extent cx="5943600" cy="3162300"/>
@@ -105,6 +108,9 @@
     <w:p/>
     <w:p>
       <w:r>
+        <w:rPr>
+          <w:noProof/>
+        </w:rPr>
         <w:lastRenderedPageBreak/>
         <w:drawing>
           <wp:inline distT="0" distB="0" distL="0" distR="0" wp14:anchorId="536B5DE3" wp14:editId="1BF6E9E7">
@@ -148,6 +154,9 @@
     <w:p/>
     <w:p>
       <w:r>
+        <w:rPr>
+          <w:noProof/>
+        </w:rPr>
         <w:drawing>
           <wp:inline distT="0" distB="0" distL="0" distR="0" wp14:anchorId="2A324877" wp14:editId="5A16F1D0">
             <wp:extent cx="5943600" cy="3203575"/>
@@ -252,6 +261,9 @@
     <w:p/>
     <w:p>
       <w:r>
+        <w:rPr>
+          <w:noProof/>
+        </w:rPr>
         <w:drawing>
           <wp:inline distT="0" distB="0" distL="0" distR="0" wp14:anchorId="170D0E68" wp14:editId="0EF46CFC">
             <wp:extent cx="5943600" cy="3178175"/>
@@ -466,6 +478,7 @@
         <w:rPr>
           <w:b/>
           <w:bCs/>
+          <w:noProof/>
         </w:rPr>
         <w:drawing>
           <wp:inline distT="0" distB="0" distL="0" distR="0" wp14:anchorId="3E2A3110" wp14:editId="697E9EE6">
@@ -750,6 +763,9 @@
     <w:p/>
     <w:p>
       <w:r>
+        <w:rPr>
+          <w:noProof/>
+        </w:rPr>
         <w:drawing>
           <wp:inline distT="0" distB="0" distL="0" distR="0" wp14:anchorId="00FC8B56" wp14:editId="391C02A5">
             <wp:extent cx="5943600" cy="3211830"/>
@@ -1113,6 +1129,9 @@
     <w:p/>
     <w:p>
       <w:r>
+        <w:rPr>
+          <w:noProof/>
+        </w:rPr>
         <w:lastRenderedPageBreak/>
         <w:drawing>
           <wp:inline distT="0" distB="0" distL="0" distR="0" wp14:anchorId="6941C6D8" wp14:editId="34D2EE80">
@@ -1233,6 +1252,9 @@
     <w:p/>
     <w:p>
       <w:r>
+        <w:rPr>
+          <w:noProof/>
+        </w:rPr>
         <w:drawing>
           <wp:inline distT="0" distB="0" distL="0" distR="0" wp14:anchorId="0E3E0D33" wp14:editId="25D062DF">
             <wp:extent cx="5943600" cy="3211195"/>
@@ -1401,6 +1423,9 @@
     <w:p/>
     <w:p>
       <w:r>
+        <w:rPr>
+          <w:noProof/>
+        </w:rPr>
         <w:lastRenderedPageBreak/>
         <w:drawing>
           <wp:inline distT="0" distB="0" distL="0" distR="0" wp14:anchorId="7D86E44E" wp14:editId="28EB2BA4">
@@ -1457,6 +1482,9 @@
     <w:p/>
     <w:p>
       <w:r>
+        <w:rPr>
+          <w:noProof/>
+        </w:rPr>
         <w:drawing>
           <wp:inline distT="0" distB="0" distL="0" distR="0" wp14:anchorId="0B1C745F" wp14:editId="4143F801">
             <wp:extent cx="5943600" cy="3162935"/>
@@ -1801,6 +1829,9 @@
     <w:p/>
     <w:p>
       <w:r>
+        <w:rPr>
+          <w:noProof/>
+        </w:rPr>
         <w:drawing>
           <wp:inline distT="0" distB="0" distL="0" distR="0" wp14:anchorId="09C7420F" wp14:editId="00C543CF">
             <wp:extent cx="5943600" cy="3184525"/>
@@ -1992,6 +2023,9 @@
     <w:p/>
     <w:p>
       <w:r>
+        <w:rPr>
+          <w:noProof/>
+        </w:rPr>
         <w:drawing>
           <wp:inline distT="0" distB="0" distL="0" distR="0" wp14:anchorId="7A4F8385" wp14:editId="50AE7114">
             <wp:extent cx="5943600" cy="3170555"/>
@@ -2449,6 +2483,9 @@
     <w:p/>
     <w:p>
       <w:r>
+        <w:rPr>
+          <w:noProof/>
+        </w:rPr>
         <w:drawing>
           <wp:inline distT="0" distB="0" distL="0" distR="0" wp14:anchorId="60403682" wp14:editId="02B3227B">
             <wp:extent cx="5943600" cy="3196590"/>
@@ -2809,10 +2846,1172 @@
     </w:p>
     <w:p/>
     <w:p/>
-    <w:p/>
-    <w:p/>
-    <w:p/>
-    <w:p/>
+    <w:p>
+      <w:r>
+        <w:t>This version also directly displays the backend values:</w:t>
+      </w:r>
+    </w:p>
+    <w:p>
+      <w:proofErr w:type="spellStart"/>
+      <w:r>
+        <w:t>requisition_type</w:t>
+      </w:r>
+      <w:proofErr w:type="spellEnd"/>
+    </w:p>
+    <w:p>
+      <w:r>
+        <w:t>Petty Cash (Approved)</w:t>
+      </w:r>
+    </w:p>
+    <w:p>
+      <w:r>
+        <w:t>PR (Approved)</w:t>
+      </w:r>
+    </w:p>
+    <w:p/>
+    <w:p>
+      <w:proofErr w:type="spellStart"/>
+      <w:r>
+        <w:t>delivered_status</w:t>
+      </w:r>
+      <w:proofErr w:type="spellEnd"/>
+    </w:p>
+    <w:p>
+      <w:r>
+        <w:t>Pending</w:t>
+      </w:r>
+    </w:p>
+    <w:p>
+      <w:r>
+        <w:t>Delivered</w:t>
+      </w:r>
+    </w:p>
+    <w:p>
+      <w:r>
+        <w:t>Rejected</w:t>
+      </w:r>
+    </w:p>
+    <w:p>
+      <w:r>
+        <w:t xml:space="preserve">For your Postman example, the table will show </w:t>
+      </w:r>
+      <w:r>
+        <w:rPr>
+          <w:b/>
+          <w:bCs/>
+        </w:rPr>
+        <w:t>Petty Cash (Approved)</w:t>
+      </w:r>
+      <w:r>
+        <w:t xml:space="preserve"> and </w:t>
+      </w:r>
+      <w:r>
+        <w:rPr>
+          <w:b/>
+          <w:bCs/>
+        </w:rPr>
+        <w:t>Pending</w:t>
+      </w:r>
+      <w:r>
+        <w:t>.</w:t>
+      </w:r>
+    </w:p>
+    <w:p/>
+    <w:p/>
+    <w:p>
+      <w:r>
+        <w:t>Graphics of Display problem, La</w:t>
+      </w:r>
+    </w:p>
+    <w:p/>
+    <w:p/>
+    <w:p>
+      <w:r>
+        <w:t>2026072629746</w:t>
+      </w:r>
+    </w:p>
+    <w:p/>
+    <w:tbl>
+      <w:tblPr>
+        <w:tblpPr w:leftFromText="180" w:rightFromText="180" w:vertAnchor="page" w:horzAnchor="page" w:tblpX="721" w:tblpY="2857"/>
+        <w:tblW w:w="7996" w:type="dxa"/>
+        <w:tblCellSpacing w:w="15" w:type="dxa"/>
+        <w:tblBorders>
+          <w:top w:val="single" w:sz="6" w:space="0" w:color="F4F4F4"/>
+          <w:left w:val="single" w:sz="6" w:space="0" w:color="F4F4F4"/>
+          <w:bottom w:val="single" w:sz="6" w:space="0" w:color="F4F4F4"/>
+          <w:right w:val="single" w:sz="6" w:space="0" w:color="F4F4F4"/>
+        </w:tblBorders>
+        <w:shd w:val="clear" w:color="auto" w:fill="FFFFFF"/>
+        <w:tblCellMar>
+          <w:top w:w="15" w:type="dxa"/>
+          <w:left w:w="15" w:type="dxa"/>
+          <w:bottom w:w="15" w:type="dxa"/>
+          <w:right w:w="15" w:type="dxa"/>
+        </w:tblCellMar>
+        <w:tblLook w:val="04A0" w:firstRow="1" w:lastRow="0" w:firstColumn="1" w:lastColumn="0" w:noHBand="0" w:noVBand="1"/>
+      </w:tblPr>
+      <w:tblGrid>
+        <w:gridCol w:w="1023"/>
+        <w:gridCol w:w="619"/>
+        <w:gridCol w:w="900"/>
+        <w:gridCol w:w="970"/>
+        <w:gridCol w:w="792"/>
+        <w:gridCol w:w="792"/>
+        <w:gridCol w:w="685"/>
+        <w:gridCol w:w="553"/>
+        <w:gridCol w:w="607"/>
+        <w:gridCol w:w="303"/>
+        <w:gridCol w:w="303"/>
+        <w:gridCol w:w="542"/>
+        <w:gridCol w:w="595"/>
+        <w:gridCol w:w="665"/>
+      </w:tblGrid>
+      <w:tr>
+        <w:trPr>
+          <w:trHeight w:val="872"/>
+          <w:tblCellSpacing w:w="15" w:type="dxa"/>
+        </w:trPr>
+        <w:tc>
+          <w:tcPr>
+            <w:tcW w:w="0" w:type="auto"/>
+            <w:tcBorders>
+              <w:top w:val="single" w:sz="6" w:space="0" w:color="F4F4F4"/>
+              <w:left w:val="single" w:sz="6" w:space="0" w:color="F4F4F4"/>
+              <w:bottom w:val="single" w:sz="6" w:space="0" w:color="F4F4F4"/>
+              <w:right w:val="single" w:sz="6" w:space="0" w:color="F4F4F4"/>
+            </w:tcBorders>
+            <w:shd w:val="clear" w:color="auto" w:fill="F9F9F9"/>
+            <w:tcMar>
+              <w:top w:w="120" w:type="dxa"/>
+              <w:left w:w="120" w:type="dxa"/>
+              <w:bottom w:w="120" w:type="dxa"/>
+              <w:right w:w="120" w:type="dxa"/>
+            </w:tcMar>
+            <w:hideMark/>
+          </w:tcPr>
+          <w:p>
+            <w:hyperlink r:id="rId19" w:history="1">
+              <w:r>
+                <w:rPr>
+                  <w:rStyle w:val="Hyperlink"/>
+                </w:rPr>
+                <w:t>2026072629746</w:t>
+              </w:r>
+            </w:hyperlink>
+          </w:p>
+        </w:tc>
+        <w:tc>
+          <w:tcPr>
+            <w:tcW w:w="0" w:type="auto"/>
+            <w:tcBorders>
+              <w:top w:val="single" w:sz="6" w:space="0" w:color="F4F4F4"/>
+              <w:left w:val="single" w:sz="6" w:space="0" w:color="F4F4F4"/>
+              <w:bottom w:val="single" w:sz="6" w:space="0" w:color="F4F4F4"/>
+              <w:right w:val="single" w:sz="6" w:space="0" w:color="F4F4F4"/>
+            </w:tcBorders>
+            <w:shd w:val="clear" w:color="auto" w:fill="F9F9F9"/>
+            <w:tcMar>
+              <w:top w:w="120" w:type="dxa"/>
+              <w:left w:w="120" w:type="dxa"/>
+              <w:bottom w:w="120" w:type="dxa"/>
+              <w:right w:w="120" w:type="dxa"/>
+            </w:tcMar>
+            <w:hideMark/>
+          </w:tcPr>
+          <w:p>
+            <w:r>
+              <w:rPr>
+                <w:b/>
+                <w:bCs/>
+              </w:rPr>
+              <w:t>Md. Khairul Islam</w:t>
+            </w:r>
+            <w:r>
+              <w:br/>
+              <w:t>02-0693</w:t>
+            </w:r>
+          </w:p>
+        </w:tc>
+        <w:tc>
+          <w:tcPr>
+            <w:tcW w:w="0" w:type="auto"/>
+            <w:tcBorders>
+              <w:top w:val="single" w:sz="6" w:space="0" w:color="F4F4F4"/>
+              <w:left w:val="single" w:sz="6" w:space="0" w:color="F4F4F4"/>
+              <w:bottom w:val="single" w:sz="6" w:space="0" w:color="F4F4F4"/>
+              <w:right w:val="single" w:sz="6" w:space="0" w:color="F4F4F4"/>
+            </w:tcBorders>
+            <w:shd w:val="clear" w:color="auto" w:fill="F9F9F9"/>
+            <w:tcMar>
+              <w:top w:w="120" w:type="dxa"/>
+              <w:left w:w="120" w:type="dxa"/>
+              <w:bottom w:w="120" w:type="dxa"/>
+              <w:right w:w="120" w:type="dxa"/>
+            </w:tcMar>
+            <w:hideMark/>
+          </w:tcPr>
+          <w:p>
+            <w:r>
+              <w:t>01847183580</w:t>
+            </w:r>
+          </w:p>
+        </w:tc>
+        <w:tc>
+          <w:tcPr>
+            <w:tcW w:w="0" w:type="auto"/>
+            <w:tcBorders>
+              <w:top w:val="single" w:sz="6" w:space="0" w:color="F4F4F4"/>
+              <w:left w:val="single" w:sz="6" w:space="0" w:color="F4F4F4"/>
+              <w:bottom w:val="single" w:sz="6" w:space="0" w:color="F4F4F4"/>
+              <w:right w:val="single" w:sz="6" w:space="0" w:color="F4F4F4"/>
+            </w:tcBorders>
+            <w:shd w:val="clear" w:color="auto" w:fill="F9F9F9"/>
+            <w:tcMar>
+              <w:top w:w="120" w:type="dxa"/>
+              <w:left w:w="120" w:type="dxa"/>
+              <w:bottom w:w="120" w:type="dxa"/>
+              <w:right w:w="120" w:type="dxa"/>
+            </w:tcMar>
+            <w:hideMark/>
+          </w:tcPr>
+          <w:p>
+            <w:r>
+              <w:t>UPS battery/backup</w:t>
+            </w:r>
+          </w:p>
+        </w:tc>
+        <w:tc>
+          <w:tcPr>
+            <w:tcW w:w="0" w:type="auto"/>
+            <w:tcBorders>
+              <w:top w:val="single" w:sz="6" w:space="0" w:color="F4F4F4"/>
+              <w:left w:val="single" w:sz="6" w:space="0" w:color="F4F4F4"/>
+              <w:bottom w:val="single" w:sz="6" w:space="0" w:color="F4F4F4"/>
+              <w:right w:val="single" w:sz="6" w:space="0" w:color="F4F4F4"/>
+            </w:tcBorders>
+            <w:shd w:val="clear" w:color="auto" w:fill="F9F9F9"/>
+            <w:tcMar>
+              <w:top w:w="120" w:type="dxa"/>
+              <w:left w:w="120" w:type="dxa"/>
+              <w:bottom w:w="120" w:type="dxa"/>
+              <w:right w:w="120" w:type="dxa"/>
+            </w:tcMar>
+            <w:hideMark/>
+          </w:tcPr>
+          <w:p>
+            <w:r>
+              <w:rPr>
+                <w:b/>
+                <w:bCs/>
+              </w:rPr>
+              <w:t>Deputy Manager</w:t>
+            </w:r>
+            <w:r>
+              <w:br/>
+              <w:t>Technology and Operations</w:t>
+            </w:r>
+          </w:p>
+        </w:tc>
+        <w:tc>
+          <w:tcPr>
+            <w:tcW w:w="0" w:type="auto"/>
+            <w:tcBorders>
+              <w:top w:val="single" w:sz="6" w:space="0" w:color="F4F4F4"/>
+              <w:left w:val="single" w:sz="6" w:space="0" w:color="F4F4F4"/>
+              <w:bottom w:val="single" w:sz="6" w:space="0" w:color="F4F4F4"/>
+              <w:right w:val="single" w:sz="6" w:space="0" w:color="F4F4F4"/>
+            </w:tcBorders>
+            <w:shd w:val="clear" w:color="auto" w:fill="F9F9F9"/>
+            <w:tcMar>
+              <w:top w:w="120" w:type="dxa"/>
+              <w:left w:w="120" w:type="dxa"/>
+              <w:bottom w:w="120" w:type="dxa"/>
+              <w:right w:w="120" w:type="dxa"/>
+            </w:tcMar>
+            <w:hideMark/>
+          </w:tcPr>
+          <w:p>
+            <w:r>
+              <w:rPr>
+                <w:b/>
+                <w:bCs/>
+              </w:rPr>
+              <w:t>Deputy Manager</w:t>
+            </w:r>
+            <w:r>
+              <w:br/>
+              <w:t>Technology and Operations</w:t>
+            </w:r>
+          </w:p>
+        </w:tc>
+        <w:tc>
+          <w:tcPr>
+            <w:tcW w:w="0" w:type="auto"/>
+            <w:tcBorders>
+              <w:top w:val="single" w:sz="6" w:space="0" w:color="F4F4F4"/>
+              <w:left w:val="single" w:sz="6" w:space="0" w:color="F4F4F4"/>
+              <w:bottom w:val="single" w:sz="6" w:space="0" w:color="F4F4F4"/>
+              <w:right w:val="single" w:sz="6" w:space="0" w:color="F4F4F4"/>
+            </w:tcBorders>
+            <w:shd w:val="clear" w:color="auto" w:fill="F9F9F9"/>
+            <w:tcMar>
+              <w:top w:w="120" w:type="dxa"/>
+              <w:left w:w="120" w:type="dxa"/>
+              <w:bottom w:w="120" w:type="dxa"/>
+              <w:right w:w="120" w:type="dxa"/>
+            </w:tcMar>
+            <w:hideMark/>
+          </w:tcPr>
+          <w:p>
+            <w:r>
+              <w:t>0 Months 15 Days</w:t>
+            </w:r>
+            <w:r>
+              <w:br/>
+              <w:t>01:37:58 Hours</w:t>
+            </w:r>
+          </w:p>
+        </w:tc>
+        <w:tc>
+          <w:tcPr>
+            <w:tcW w:w="0" w:type="auto"/>
+            <w:tcBorders>
+              <w:top w:val="single" w:sz="6" w:space="0" w:color="F4F4F4"/>
+              <w:left w:val="single" w:sz="6" w:space="0" w:color="F4F4F4"/>
+              <w:bottom w:val="single" w:sz="6" w:space="0" w:color="F4F4F4"/>
+              <w:right w:val="single" w:sz="6" w:space="0" w:color="F4F4F4"/>
+            </w:tcBorders>
+            <w:shd w:val="clear" w:color="auto" w:fill="F9F9F9"/>
+            <w:tcMar>
+              <w:top w:w="120" w:type="dxa"/>
+              <w:left w:w="120" w:type="dxa"/>
+              <w:bottom w:w="120" w:type="dxa"/>
+              <w:right w:w="120" w:type="dxa"/>
+            </w:tcMar>
+            <w:hideMark/>
+          </w:tcPr>
+          <w:p>
+            <w:r>
+              <w:t>Ruhul Amin</w:t>
+            </w:r>
+          </w:p>
+        </w:tc>
+        <w:tc>
+          <w:tcPr>
+            <w:tcW w:w="0" w:type="auto"/>
+            <w:tcBorders>
+              <w:top w:val="single" w:sz="6" w:space="0" w:color="F4F4F4"/>
+              <w:left w:val="single" w:sz="6" w:space="0" w:color="F4F4F4"/>
+              <w:bottom w:val="single" w:sz="6" w:space="0" w:color="F4F4F4"/>
+              <w:right w:val="single" w:sz="6" w:space="0" w:color="F4F4F4"/>
+            </w:tcBorders>
+            <w:shd w:val="clear" w:color="auto" w:fill="F9F9F9"/>
+            <w:tcMar>
+              <w:top w:w="120" w:type="dxa"/>
+              <w:left w:w="120" w:type="dxa"/>
+              <w:bottom w:w="120" w:type="dxa"/>
+              <w:right w:w="120" w:type="dxa"/>
+            </w:tcMar>
+            <w:hideMark/>
+          </w:tcPr>
+          <w:p>
+            <w:r>
+              <w:t>Khairul Islam</w:t>
+            </w:r>
+          </w:p>
+        </w:tc>
+        <w:tc>
+          <w:tcPr>
+            <w:tcW w:w="0" w:type="auto"/>
+            <w:tcBorders>
+              <w:top w:val="single" w:sz="6" w:space="0" w:color="F4F4F4"/>
+              <w:left w:val="single" w:sz="6" w:space="0" w:color="F4F4F4"/>
+              <w:bottom w:val="single" w:sz="6" w:space="0" w:color="F4F4F4"/>
+              <w:right w:val="single" w:sz="6" w:space="0" w:color="F4F4F4"/>
+            </w:tcBorders>
+            <w:shd w:val="clear" w:color="auto" w:fill="F9F9F9"/>
+            <w:tcMar>
+              <w:top w:w="120" w:type="dxa"/>
+              <w:left w:w="120" w:type="dxa"/>
+              <w:bottom w:w="120" w:type="dxa"/>
+              <w:right w:w="120" w:type="dxa"/>
+            </w:tcMar>
+            <w:hideMark/>
+          </w:tcPr>
+          <w:p/>
+        </w:tc>
+        <w:tc>
+          <w:tcPr>
+            <w:tcW w:w="0" w:type="auto"/>
+            <w:tcBorders>
+              <w:top w:val="single" w:sz="6" w:space="0" w:color="F4F4F4"/>
+              <w:left w:val="single" w:sz="6" w:space="0" w:color="F4F4F4"/>
+              <w:bottom w:val="single" w:sz="6" w:space="0" w:color="F4F4F4"/>
+              <w:right w:val="single" w:sz="6" w:space="0" w:color="F4F4F4"/>
+            </w:tcBorders>
+            <w:shd w:val="clear" w:color="auto" w:fill="F9F9F9"/>
+            <w:tcMar>
+              <w:top w:w="120" w:type="dxa"/>
+              <w:left w:w="120" w:type="dxa"/>
+              <w:bottom w:w="120" w:type="dxa"/>
+              <w:right w:w="120" w:type="dxa"/>
+            </w:tcMar>
+            <w:hideMark/>
+          </w:tcPr>
+          <w:p/>
+        </w:tc>
+        <w:tc>
+          <w:tcPr>
+            <w:tcW w:w="0" w:type="auto"/>
+            <w:tcBorders>
+              <w:top w:val="single" w:sz="6" w:space="0" w:color="F4F4F4"/>
+              <w:left w:val="single" w:sz="6" w:space="0" w:color="F4F4F4"/>
+              <w:bottom w:val="single" w:sz="6" w:space="0" w:color="F4F4F4"/>
+              <w:right w:val="single" w:sz="6" w:space="0" w:color="F4F4F4"/>
+            </w:tcBorders>
+            <w:shd w:val="clear" w:color="auto" w:fill="F9F9F9"/>
+            <w:tcMar>
+              <w:top w:w="120" w:type="dxa"/>
+              <w:left w:w="120" w:type="dxa"/>
+              <w:bottom w:w="120" w:type="dxa"/>
+              <w:right w:w="120" w:type="dxa"/>
+            </w:tcMar>
+            <w:hideMark/>
+          </w:tcPr>
+          <w:p>
+            <w:r>
+              <w:rPr>
+                <w:b/>
+                <w:bCs/>
+              </w:rPr>
+              <w:t>Open</w:t>
+            </w:r>
+          </w:p>
+        </w:tc>
+        <w:tc>
+          <w:tcPr>
+            <w:tcW w:w="0" w:type="auto"/>
+            <w:tcBorders>
+              <w:top w:val="single" w:sz="6" w:space="0" w:color="F4F4F4"/>
+              <w:left w:val="single" w:sz="6" w:space="0" w:color="F4F4F4"/>
+              <w:bottom w:val="single" w:sz="6" w:space="0" w:color="F4F4F4"/>
+              <w:right w:val="single" w:sz="6" w:space="0" w:color="F4F4F4"/>
+            </w:tcBorders>
+            <w:shd w:val="clear" w:color="auto" w:fill="F9F9F9"/>
+            <w:tcMar>
+              <w:top w:w="120" w:type="dxa"/>
+              <w:left w:w="120" w:type="dxa"/>
+              <w:bottom w:w="120" w:type="dxa"/>
+              <w:right w:w="120" w:type="dxa"/>
+            </w:tcMar>
+            <w:hideMark/>
+          </w:tcPr>
+          <w:p>
+            <w:r>
+              <w:rPr>
+                <w:b/>
+                <w:bCs/>
+              </w:rPr>
+              <w:t>Raised</w:t>
+            </w:r>
+          </w:p>
+        </w:tc>
+        <w:tc>
+          <w:tcPr>
+            <w:tcW w:w="0" w:type="auto"/>
+            <w:tcBorders>
+              <w:top w:val="single" w:sz="6" w:space="0" w:color="F4F4F4"/>
+              <w:left w:val="single" w:sz="6" w:space="0" w:color="F4F4F4"/>
+              <w:bottom w:val="single" w:sz="6" w:space="0" w:color="F4F4F4"/>
+              <w:right w:val="single" w:sz="2" w:space="0" w:color="F4F4F4"/>
+            </w:tcBorders>
+            <w:shd w:val="clear" w:color="auto" w:fill="F9F9F9"/>
+            <w:tcMar>
+              <w:top w:w="120" w:type="dxa"/>
+              <w:left w:w="120" w:type="dxa"/>
+              <w:bottom w:w="120" w:type="dxa"/>
+              <w:right w:w="120" w:type="dxa"/>
+            </w:tcMar>
+            <w:hideMark/>
+          </w:tcPr>
+          <w:p>
+            <w:r>
+              <w:rPr>
+                <w:b/>
+                <w:bCs/>
+              </w:rPr>
+              <w:t>Pending</w:t>
+            </w:r>
+          </w:p>
+        </w:tc>
+      </w:tr>
+    </w:tbl>
+    <w:p/>
+    <w:p/>
+    <w:p/>
+    <w:p/>
+    <w:p/>
+    <w:p/>
+    <w:p/>
+    <w:p/>
+    <w:p/>
+    <w:p/>
+    <w:p/>
+    <w:p>
+      <w:proofErr w:type="spellStart"/>
+      <w:r>
+        <w:t>tbl_trouble_input.device_requis_val</w:t>
+      </w:r>
+      <w:proofErr w:type="spellEnd"/>
+      <w:r>
+        <w:t xml:space="preserve"> → </w:t>
+      </w:r>
+      <w:proofErr w:type="spellStart"/>
+      <w:r>
+        <w:t>trouble_tickets.source_device_requisition</w:t>
+      </w:r>
+      <w:proofErr w:type="spellEnd"/>
+      <w:r>
+        <w:t xml:space="preserve"> </w:t>
+      </w:r>
+      <w:proofErr w:type="spellStart"/>
+      <w:r>
+        <w:t>tbl_tt_reason.approved_val</w:t>
+      </w:r>
+      <w:proofErr w:type="spellEnd"/>
+      <w:r>
+        <w:t xml:space="preserve"> / </w:t>
+      </w:r>
+      <w:proofErr w:type="spellStart"/>
+      <w:r>
+        <w:t>delivered_val</w:t>
+      </w:r>
+      <w:proofErr w:type="spellEnd"/>
+      <w:r>
+        <w:t xml:space="preserve"> → </w:t>
+      </w:r>
+      <w:proofErr w:type="spellStart"/>
+      <w:r>
+        <w:t>tt_reasons.approved_val</w:t>
+      </w:r>
+      <w:proofErr w:type="spellEnd"/>
+      <w:r>
+        <w:t xml:space="preserve"> / </w:t>
+      </w:r>
+      <w:proofErr w:type="spellStart"/>
+      <w:r>
+        <w:t>delivered_val</w:t>
+      </w:r>
+      <w:proofErr w:type="spellEnd"/>
+    </w:p>
+    <w:p/>
+    <w:p/>
+    <w:p/>
+    <w:p/>
+    <w:p/>
+    <w:p/>
+    <w:p/>
+    <w:p/>
+    <w:p/>
+    <w:p/>
+    <w:p>
+      <w:r>
+        <w:t xml:space="preserve">Good — this confirms PostgreSQL already contains </w:t>
+      </w:r>
+      <w:r>
+        <w:rPr>
+          <w:b/>
+          <w:bCs/>
+        </w:rPr>
+        <w:t xml:space="preserve">95 Trouble Tickets with </w:t>
+      </w:r>
+      <w:proofErr w:type="spellStart"/>
+      <w:r>
+        <w:rPr>
+          <w:b/>
+          <w:bCs/>
+        </w:rPr>
+        <w:t>source_device_requisition</w:t>
+      </w:r>
+      <w:proofErr w:type="spellEnd"/>
+      <w:r>
+        <w:rPr>
+          <w:b/>
+          <w:bCs/>
+        </w:rPr>
+        <w:t xml:space="preserve"> = 3</w:t>
+      </w:r>
+      <w:r>
+        <w:t>. That means we can now move to the display mapping.</w:t>
+      </w:r>
+    </w:p>
+    <w:p>
+      <w:r>
+        <w:t>For the new module, use this rule:</w:t>
+      </w:r>
+    </w:p>
+    <w:p>
+      <w:proofErr w:type="spellStart"/>
+      <w:r>
+        <w:t>source_device_requisition</w:t>
+      </w:r>
+      <w:proofErr w:type="spellEnd"/>
+      <w:r>
+        <w:t xml:space="preserve"> = 3</w:t>
+      </w:r>
+    </w:p>
+    <w:p>
+      <w:r>
+        <w:t>→ Requisition = Raised</w:t>
+      </w:r>
+    </w:p>
+    <w:p/>
+    <w:p>
+      <w:proofErr w:type="spellStart"/>
+      <w:r>
+        <w:t>delivered_val</w:t>
+      </w:r>
+      <w:proofErr w:type="spellEnd"/>
+      <w:r>
+        <w:t xml:space="preserve"> = 0</w:t>
+      </w:r>
+    </w:p>
+    <w:p>
+      <w:r>
+        <w:t>→ Delivery = Pending</w:t>
+      </w:r>
+    </w:p>
+    <w:p/>
+    <w:p>
+      <w:proofErr w:type="spellStart"/>
+      <w:r>
+        <w:t>delivered_val</w:t>
+      </w:r>
+      <w:proofErr w:type="spellEnd"/>
+      <w:r>
+        <w:t xml:space="preserve"> = 1</w:t>
+      </w:r>
+    </w:p>
+    <w:p>
+      <w:r>
+        <w:t>→ Delivery = Delivered</w:t>
+      </w:r>
+    </w:p>
+    <w:p/>
+    <w:p>
+      <w:proofErr w:type="spellStart"/>
+      <w:r>
+        <w:t>delivered_val</w:t>
+      </w:r>
+      <w:proofErr w:type="spellEnd"/>
+      <w:r>
+        <w:t xml:space="preserve"> = 2</w:t>
+      </w:r>
+    </w:p>
+    <w:p>
+      <w:r>
+        <w:t>→ Delivery = Rejected</w:t>
+      </w:r>
+    </w:p>
+    <w:p/>
+    <w:p>
+      <w:proofErr w:type="spellStart"/>
+      <w:r>
+        <w:t>source_device_requisition</w:t>
+      </w:r>
+      <w:proofErr w:type="spellEnd"/>
+      <w:r>
+        <w:t xml:space="preserve"> = 3 + no delivery record</w:t>
+      </w:r>
+    </w:p>
+    <w:p>
+      <w:r>
+        <w:t>→ Delivery = Pending</w:t>
+      </w:r>
+    </w:p>
+    <w:p/>
+    <w:p/>
+    <w:p/>
+    <w:p/>
+    <w:p/>
+    <w:p/>
+    <w:p/>
+    <w:p/>
+    <w:p>
+      <w:r>
+        <w:lastRenderedPageBreak/>
+        <w:t>SELECT</w:t>
+      </w:r>
+    </w:p>
+    <w:p>
+      <w:r>
+        <w:t xml:space="preserve">    id,</w:t>
+      </w:r>
+    </w:p>
+    <w:p>
+      <w:r>
+        <w:t xml:space="preserve">    </w:t>
+      </w:r>
+      <w:proofErr w:type="spellStart"/>
+      <w:r>
+        <w:t>tt_no</w:t>
+      </w:r>
+      <w:proofErr w:type="spellEnd"/>
+      <w:r>
+        <w:t>,</w:t>
+      </w:r>
+    </w:p>
+    <w:p>
+      <w:r>
+        <w:t xml:space="preserve">    </w:t>
+      </w:r>
+      <w:proofErr w:type="spellStart"/>
+      <w:r>
+        <w:t>source_device_requisition</w:t>
+      </w:r>
+      <w:proofErr w:type="spellEnd"/>
+    </w:p>
+    <w:p>
+      <w:r>
+        <w:t xml:space="preserve">FROM </w:t>
+      </w:r>
+      <w:proofErr w:type="spellStart"/>
+      <w:r>
+        <w:t>public.trouble_tickets</w:t>
+      </w:r>
+      <w:proofErr w:type="spellEnd"/>
+    </w:p>
+    <w:p>
+      <w:r>
+        <w:t>WHERE BTRIM(</w:t>
+      </w:r>
+      <w:proofErr w:type="spellStart"/>
+      <w:r>
+        <w:t>tt_no</w:t>
+      </w:r>
+      <w:proofErr w:type="spellEnd"/>
+      <w:r>
+        <w:t>) = '2026072629746';</w:t>
+      </w:r>
+    </w:p>
+    <w:p/>
+    <w:p/>
+    <w:p>
+      <w:r>
+        <w:rPr>
+          <w:noProof/>
+        </w:rPr>
+        <w:drawing>
+          <wp:inline distT="0" distB="0" distL="0" distR="0" wp14:anchorId="33DE0D9D" wp14:editId="2247F049">
+            <wp:extent cx="5943600" cy="3197225"/>
+            <wp:effectExtent l="0" t="0" r="0" b="3175"/>
+            <wp:docPr id="505838609" name="Picture 1"/>
+            <wp:cNvGraphicFramePr>
+              <a:graphicFrameLocks xmlns:a="http://schemas.openxmlformats.org/drawingml/2006/main" noChangeAspect="1"/>
+            </wp:cNvGraphicFramePr>
+            <a:graphic xmlns:a="http://schemas.openxmlformats.org/drawingml/2006/main">
+              <a:graphicData uri="http://schemas.openxmlformats.org/drawingml/2006/picture">
+                <pic:pic xmlns:pic="http://schemas.openxmlformats.org/drawingml/2006/picture">
+                  <pic:nvPicPr>
+                    <pic:cNvPr id="505838609" name=""/>
+                    <pic:cNvPicPr/>
+                  </pic:nvPicPr>
+                  <pic:blipFill>
+                    <a:blip r:embed="rId20"/>
+                    <a:stretch>
+                      <a:fillRect/>
+                    </a:stretch>
+                  </pic:blipFill>
+                  <pic:spPr>
+                    <a:xfrm>
+                      <a:off x="0" y="0"/>
+                      <a:ext cx="5943600" cy="3197225"/>
+                    </a:xfrm>
+                    <a:prstGeom prst="rect">
+                      <a:avLst/>
+                    </a:prstGeom>
+                  </pic:spPr>
+                </pic:pic>
+              </a:graphicData>
+            </a:graphic>
+          </wp:inline>
+        </w:drawing>
+      </w:r>
+    </w:p>
+    <w:p/>
+    <w:p/>
+    <w:p/>
+    <w:p/>
+    <w:p/>
+    <w:p/>
+    <w:p/>
+    <w:p/>
+    <w:p/>
+    <w:p>
+      <w:r>
+        <w:t>SELECT</w:t>
+      </w:r>
+    </w:p>
+    <w:p>
+      <w:r>
+        <w:t xml:space="preserve">    </w:t>
+      </w:r>
+      <w:proofErr w:type="spellStart"/>
+      <w:r>
+        <w:t>column_name</w:t>
+      </w:r>
+      <w:proofErr w:type="spellEnd"/>
+      <w:r>
+        <w:t>,</w:t>
+      </w:r>
+    </w:p>
+    <w:p>
+      <w:r>
+        <w:t xml:space="preserve">    </w:t>
+      </w:r>
+      <w:proofErr w:type="spellStart"/>
+      <w:r>
+        <w:t>data_type</w:t>
+      </w:r>
+      <w:proofErr w:type="spellEnd"/>
+    </w:p>
+    <w:p>
+      <w:r>
+        <w:t xml:space="preserve">FROM </w:t>
+      </w:r>
+      <w:proofErr w:type="spellStart"/>
+      <w:r>
+        <w:t>information_schema.columns</w:t>
+      </w:r>
+      <w:proofErr w:type="spellEnd"/>
+    </w:p>
+    <w:p>
+      <w:r>
+        <w:t xml:space="preserve">WHERE </w:t>
+      </w:r>
+      <w:proofErr w:type="spellStart"/>
+      <w:r>
+        <w:t>table_schema</w:t>
+      </w:r>
+      <w:proofErr w:type="spellEnd"/>
+      <w:r>
+        <w:t xml:space="preserve"> = 'public'</w:t>
+      </w:r>
+    </w:p>
+    <w:p>
+      <w:r>
+        <w:t xml:space="preserve">  AND </w:t>
+      </w:r>
+      <w:proofErr w:type="spellStart"/>
+      <w:r>
+        <w:t>table_name</w:t>
+      </w:r>
+      <w:proofErr w:type="spellEnd"/>
+      <w:r>
+        <w:t xml:space="preserve"> = '</w:t>
+      </w:r>
+      <w:proofErr w:type="spellStart"/>
+      <w:r>
+        <w:t>trouble_tickets</w:t>
+      </w:r>
+      <w:proofErr w:type="spellEnd"/>
+      <w:r>
+        <w:t>'</w:t>
+      </w:r>
+    </w:p>
+    <w:p>
+      <w:r>
+        <w:t xml:space="preserve">  AND </w:t>
+      </w:r>
+      <w:proofErr w:type="spellStart"/>
+      <w:r>
+        <w:t>column_name</w:t>
+      </w:r>
+      <w:proofErr w:type="spellEnd"/>
+      <w:r>
+        <w:t xml:space="preserve"> IN (</w:t>
+      </w:r>
+    </w:p>
+    <w:p>
+      <w:r>
+        <w:t xml:space="preserve">      '</w:t>
+      </w:r>
+      <w:proofErr w:type="spellStart"/>
+      <w:r>
+        <w:t>source_device_requisition</w:t>
+      </w:r>
+      <w:proofErr w:type="spellEnd"/>
+      <w:r>
+        <w:t>',</w:t>
+      </w:r>
+    </w:p>
+    <w:p>
+      <w:r>
+        <w:t xml:space="preserve">      '</w:t>
+      </w:r>
+      <w:proofErr w:type="spellStart"/>
+      <w:r>
+        <w:t>source_requisition_by</w:t>
+      </w:r>
+      <w:proofErr w:type="spellEnd"/>
+      <w:r>
+        <w:t>',</w:t>
+      </w:r>
+    </w:p>
+    <w:p>
+      <w:r>
+        <w:t xml:space="preserve">      '</w:t>
+      </w:r>
+      <w:proofErr w:type="spellStart"/>
+      <w:r>
+        <w:t>source_requisition_date</w:t>
+      </w:r>
+      <w:proofErr w:type="spellEnd"/>
+      <w:r>
+        <w:t>'</w:t>
+      </w:r>
+    </w:p>
+    <w:p>
+      <w:r>
+        <w:t xml:space="preserve">  );</w:t>
+      </w:r>
+    </w:p>
+    <w:p/>
+    <w:p/>
+    <w:p>
+      <w:r>
+        <w:rPr>
+          <w:noProof/>
+        </w:rPr>
+        <w:drawing>
+          <wp:inline distT="0" distB="0" distL="0" distR="0" wp14:anchorId="14FB56EE" wp14:editId="0679A8C4">
+            <wp:extent cx="5943600" cy="3220720"/>
+            <wp:effectExtent l="0" t="0" r="0" b="0"/>
+            <wp:docPr id="317567531" name="Picture 1"/>
+            <wp:cNvGraphicFramePr>
+              <a:graphicFrameLocks xmlns:a="http://schemas.openxmlformats.org/drawingml/2006/main" noChangeAspect="1"/>
+            </wp:cNvGraphicFramePr>
+            <a:graphic xmlns:a="http://schemas.openxmlformats.org/drawingml/2006/main">
+              <a:graphicData uri="http://schemas.openxmlformats.org/drawingml/2006/picture">
+                <pic:pic xmlns:pic="http://schemas.openxmlformats.org/drawingml/2006/picture">
+                  <pic:nvPicPr>
+                    <pic:cNvPr id="317567531" name=""/>
+                    <pic:cNvPicPr/>
+                  </pic:nvPicPr>
+                  <pic:blipFill>
+                    <a:blip r:embed="rId21"/>
+                    <a:stretch>
+                      <a:fillRect/>
+                    </a:stretch>
+                  </pic:blipFill>
+                  <pic:spPr>
+                    <a:xfrm>
+                      <a:off x="0" y="0"/>
+                      <a:ext cx="5943600" cy="3220720"/>
+                    </a:xfrm>
+                    <a:prstGeom prst="rect">
+                      <a:avLst/>
+                    </a:prstGeom>
+                  </pic:spPr>
+                </pic:pic>
+              </a:graphicData>
+            </a:graphic>
+          </wp:inline>
+        </w:drawing>
+      </w:r>
+    </w:p>
+    <w:p/>
+    <w:p/>
+    <w:p/>
+    <w:p>
+      <w:r>
+        <w:drawing>
+          <wp:inline distT="0" distB="0" distL="0" distR="0" wp14:anchorId="1F8110B6" wp14:editId="356AC938">
+            <wp:extent cx="4816257" cy="2933954"/>
+            <wp:effectExtent l="0" t="0" r="3810" b="0"/>
+            <wp:docPr id="1999520791" name="Picture 1"/>
+            <wp:cNvGraphicFramePr>
+              <a:graphicFrameLocks xmlns:a="http://schemas.openxmlformats.org/drawingml/2006/main" noChangeAspect="1"/>
+            </wp:cNvGraphicFramePr>
+            <a:graphic xmlns:a="http://schemas.openxmlformats.org/drawingml/2006/main">
+              <a:graphicData uri="http://schemas.openxmlformats.org/drawingml/2006/picture">
+                <pic:pic xmlns:pic="http://schemas.openxmlformats.org/drawingml/2006/picture">
+                  <pic:nvPicPr>
+                    <pic:cNvPr id="1999520791" name=""/>
+                    <pic:cNvPicPr/>
+                  </pic:nvPicPr>
+                  <pic:blipFill>
+                    <a:blip r:embed="rId22"/>
+                    <a:stretch>
+                      <a:fillRect/>
+                    </a:stretch>
+                  </pic:blipFill>
+                  <pic:spPr>
+                    <a:xfrm>
+                      <a:off x="0" y="0"/>
+                      <a:ext cx="4816257" cy="2933954"/>
+                    </a:xfrm>
+                    <a:prstGeom prst="rect">
+                      <a:avLst/>
+                    </a:prstGeom>
+                  </pic:spPr>
+                </pic:pic>
+              </a:graphicData>
+            </a:graphic>
+          </wp:inline>
+        </w:drawing>
+      </w:r>
+    </w:p>
+    <w:p/>
+    <w:p/>
+    <w:p/>
+    <w:p/>
+    <w:p/>
+    <w:p/>
+    <w:p/>
+    <w:p/>
+    <w:p/>
+    <w:p/>
+    <w:p/>
+    <w:p/>
+    <w:p/>
+    <w:p>
+      <w:r>
+        <w:lastRenderedPageBreak/>
+        <w:t>For your required business rule:</w:t>
+      </w:r>
+    </w:p>
+    <w:p/>
+    <w:p>
+      <w:proofErr w:type="spellStart"/>
+      <w:r>
+        <w:t>source_device_requisition</w:t>
+      </w:r>
+      <w:proofErr w:type="spellEnd"/>
+      <w:r>
+        <w:t xml:space="preserve"> = 3</w:t>
+      </w:r>
+    </w:p>
+    <w:p>
+      <w:r>
+        <w:t xml:space="preserve">+ </w:t>
+      </w:r>
+      <w:proofErr w:type="spellStart"/>
+      <w:r>
+        <w:t>approved_val</w:t>
+      </w:r>
+      <w:proofErr w:type="spellEnd"/>
+      <w:r>
+        <w:t xml:space="preserve"> = NULL/0</w:t>
+      </w:r>
+    </w:p>
+    <w:p>
+      <w:r>
+        <w:t>→ Requisition = Raised</w:t>
+      </w:r>
+    </w:p>
+    <w:p>
+      <w:r>
+        <w:t>→ Delivery    = Pending</w:t>
+      </w:r>
+    </w:p>
+    <w:p/>
+    <w:p>
+      <w:proofErr w:type="spellStart"/>
+      <w:r>
+        <w:t>approved_val</w:t>
+      </w:r>
+      <w:proofErr w:type="spellEnd"/>
+      <w:r>
+        <w:t xml:space="preserve"> = 1</w:t>
+      </w:r>
+    </w:p>
+    <w:p>
+      <w:r>
+        <w:t>→ Petty Cash (Approved)</w:t>
+      </w:r>
+    </w:p>
+    <w:p/>
+    <w:p>
+      <w:proofErr w:type="spellStart"/>
+      <w:r>
+        <w:t>approved_val</w:t>
+      </w:r>
+      <w:proofErr w:type="spellEnd"/>
+      <w:r>
+        <w:t xml:space="preserve"> = 3</w:t>
+      </w:r>
+    </w:p>
+    <w:p>
+      <w:r>
+        <w:t>→ PR (Approved)</w:t>
+      </w:r>
+    </w:p>
+    <w:p/>
+    <w:p>
+      <w:proofErr w:type="spellStart"/>
+      <w:r>
+        <w:t>approved_val</w:t>
+      </w:r>
+      <w:proofErr w:type="spellEnd"/>
+      <w:r>
+        <w:t xml:space="preserve"> = 2</w:t>
+      </w:r>
+    </w:p>
+    <w:p>
+      <w:r>
+        <w:t>→ Rejected</w:t>
+      </w:r>
+    </w:p>
+    <w:p/>
+    <w:p>
+      <w:proofErr w:type="spellStart"/>
+      <w:r>
+        <w:t>delivered_val</w:t>
+      </w:r>
+      <w:proofErr w:type="spellEnd"/>
+      <w:r>
+        <w:t xml:space="preserve"> = 0</w:t>
+      </w:r>
+    </w:p>
+    <w:p>
+      <w:r>
+        <w:t>→ Pending</w:t>
+      </w:r>
+    </w:p>
+    <w:p/>
+    <w:p>
+      <w:proofErr w:type="spellStart"/>
+      <w:r>
+        <w:t>delivered_val</w:t>
+      </w:r>
+      <w:proofErr w:type="spellEnd"/>
+      <w:r>
+        <w:t xml:space="preserve"> = 1</w:t>
+      </w:r>
+    </w:p>
+    <w:p>
+      <w:r>
+        <w:t>→ Delivered</w:t>
+      </w:r>
+    </w:p>
+    <w:p/>
+    <w:p>
+      <w:proofErr w:type="spellStart"/>
+      <w:r>
+        <w:t>delivered_val</w:t>
+      </w:r>
+      <w:proofErr w:type="spellEnd"/>
+      <w:r>
+        <w:t xml:space="preserve"> = 2</w:t>
+      </w:r>
+    </w:p>
+    <w:p>
+      <w:r>
+        <w:t>→ Rejected</w:t>
+      </w:r>
+    </w:p>
     <w:sectPr>
       <w:pgSz w:w="12240" w:h="15840"/>
       <w:pgMar w:top="1440" w:right="1440" w:bottom="1440" w:left="1440" w:header="720" w:footer="720" w:gutter="0"/>

</xml_diff>

<commit_message>
To Download Excel File Successfully
</commit_message>
<xml_diff>
--- a/document/Trouble Ticket Overview/TT Dashboard Integration.docx
+++ b/document/Trouble Ticket Overview/TT Dashboard Integration.docx
@@ -37,25 +37,12 @@
     </w:p>
     <w:p>
       <w:r>
-        <w:t xml:space="preserve">SELECT COUNT(*) AS </w:t>
-      </w:r>
-      <w:proofErr w:type="spellStart"/>
-      <w:r>
-        <w:t>total_trouble_tickets</w:t>
-      </w:r>
-      <w:proofErr w:type="spellEnd"/>
-    </w:p>
-    <w:p>
-      <w:r>
-        <w:t xml:space="preserve">FROM </w:t>
-      </w:r>
-      <w:proofErr w:type="spellStart"/>
-      <w:r>
-        <w:t>public.trouble_tickets</w:t>
-      </w:r>
-      <w:proofErr w:type="spellEnd"/>
-      <w:r>
-        <w:t>;</w:t>
+        <w:t>SELECT COUNT(*) AS total_trouble_tickets</w:t>
+      </w:r>
+    </w:p>
+    <w:p>
+      <w:r>
+        <w:t>FROM public.trouble_tickets;</w:t>
       </w:r>
     </w:p>
     <w:p/>
@@ -199,25 +186,12 @@
     <w:p/>
     <w:p>
       <w:r>
-        <w:t xml:space="preserve">SELECT COUNT(*) AS </w:t>
-      </w:r>
-      <w:proofErr w:type="spellStart"/>
-      <w:r>
-        <w:t>reason_rows</w:t>
-      </w:r>
-      <w:proofErr w:type="spellEnd"/>
-    </w:p>
-    <w:p>
-      <w:r>
-        <w:t xml:space="preserve">FROM </w:t>
-      </w:r>
-      <w:proofErr w:type="spellStart"/>
-      <w:r>
-        <w:t>public.stg_tt_reasons</w:t>
-      </w:r>
-      <w:proofErr w:type="spellEnd"/>
-      <w:r>
-        <w:t>;</w:t>
+        <w:t>SELECT COUNT(*) AS reason_rows</w:t>
+      </w:r>
+    </w:p>
+    <w:p>
+      <w:r>
+        <w:t>FROM public.stg_tt_reasons;</w:t>
       </w:r>
     </w:p>
     <w:p>
@@ -322,61 +296,27 @@
     </w:p>
     <w:p>
       <w:r>
-        <w:t xml:space="preserve">    </w:t>
-      </w:r>
-      <w:proofErr w:type="spellStart"/>
-      <w:r>
-        <w:t>tt_no</w:t>
-      </w:r>
-      <w:proofErr w:type="spellEnd"/>
-      <w:r>
-        <w:t>,</w:t>
-      </w:r>
-    </w:p>
-    <w:p>
-      <w:r>
-        <w:t xml:space="preserve">    </w:t>
-      </w:r>
-      <w:proofErr w:type="spellStart"/>
-      <w:r>
-        <w:t>approved_val</w:t>
-      </w:r>
-      <w:proofErr w:type="spellEnd"/>
-      <w:r>
-        <w:t>,</w:t>
-      </w:r>
-    </w:p>
-    <w:p>
-      <w:r>
-        <w:t xml:space="preserve">    </w:t>
-      </w:r>
-      <w:proofErr w:type="spellStart"/>
-      <w:r>
-        <w:t>delivered_val</w:t>
-      </w:r>
-      <w:proofErr w:type="spellEnd"/>
-    </w:p>
-    <w:p>
-      <w:r>
-        <w:t xml:space="preserve">FROM </w:t>
-      </w:r>
-      <w:proofErr w:type="spellStart"/>
-      <w:r>
-        <w:t>public.stg_tt_reasons</w:t>
-      </w:r>
-      <w:proofErr w:type="spellEnd"/>
-    </w:p>
-    <w:p>
-      <w:r>
-        <w:t>WHERE BTRIM(</w:t>
-      </w:r>
-      <w:proofErr w:type="spellStart"/>
-      <w:r>
-        <w:t>tt_no</w:t>
-      </w:r>
-      <w:proofErr w:type="spellEnd"/>
-      <w:r>
-        <w:t>) = '2026072129719';</w:t>
+        <w:t xml:space="preserve">    tt_no,</w:t>
+      </w:r>
+    </w:p>
+    <w:p>
+      <w:r>
+        <w:t xml:space="preserve">    approved_val,</w:t>
+      </w:r>
+    </w:p>
+    <w:p>
+      <w:r>
+        <w:t xml:space="preserve">    delivered_val</w:t>
+      </w:r>
+    </w:p>
+    <w:p>
+      <w:r>
+        <w:t>FROM public.stg_tt_reasons</w:t>
+      </w:r>
+    </w:p>
+    <w:p>
+      <w:r>
+        <w:t>WHERE BTRIM(tt_no) = '2026072129719';</w:t>
       </w:r>
     </w:p>
     <w:p/>
@@ -410,45 +350,27 @@
           <w:bCs/>
         </w:rPr>
       </w:pPr>
-      <w:proofErr w:type="spellStart"/>
       <w:r>
         <w:rPr>
           <w:b/>
           <w:bCs/>
         </w:rPr>
-        <w:t>approved_val</w:t>
-      </w:r>
-      <w:proofErr w:type="spellEnd"/>
-      <w:r>
+        <w:t>approved_val  = 1</w:t>
+      </w:r>
+    </w:p>
+    <w:p>
+      <w:pPr>
         <w:rPr>
           <w:b/>
           <w:bCs/>
         </w:rPr>
-        <w:t xml:space="preserve">  = 1</w:t>
-      </w:r>
-    </w:p>
-    <w:p>
-      <w:pPr>
+      </w:pPr>
+      <w:r>
         <w:rPr>
           <w:b/>
           <w:bCs/>
         </w:rPr>
-      </w:pPr>
-      <w:proofErr w:type="spellStart"/>
-      <w:r>
-        <w:rPr>
-          <w:b/>
-          <w:bCs/>
-        </w:rPr>
-        <w:t>delivered_val</w:t>
-      </w:r>
-      <w:proofErr w:type="spellEnd"/>
-      <w:r>
-        <w:rPr>
-          <w:b/>
-          <w:bCs/>
-        </w:rPr>
-        <w:t xml:space="preserve"> = 0</w:t>
+        <w:t>delivered_val = 0</w:t>
       </w:r>
     </w:p>
     <w:p>
@@ -543,25 +465,12 @@
     </w:p>
     <w:p>
       <w:r>
-        <w:t xml:space="preserve">SELECT COUNT(*) AS </w:t>
-      </w:r>
-      <w:proofErr w:type="spellStart"/>
-      <w:r>
-        <w:t>update_rows</w:t>
-      </w:r>
-      <w:proofErr w:type="spellEnd"/>
-    </w:p>
-    <w:p>
-      <w:r>
-        <w:t xml:space="preserve">FROM </w:t>
-      </w:r>
-      <w:proofErr w:type="spellStart"/>
-      <w:r>
-        <w:t>public.stg_tt_updates</w:t>
-      </w:r>
-      <w:proofErr w:type="spellEnd"/>
-      <w:r>
-        <w:t>;</w:t>
+        <w:t>SELECT COUNT(*) AS update_rows</w:t>
+      </w:r>
+    </w:p>
+    <w:p>
+      <w:r>
+        <w:t>FROM public.stg_tt_updates;</w:t>
       </w:r>
     </w:p>
     <w:p/>
@@ -589,74 +498,32 @@
     </w:p>
     <w:p>
       <w:r>
-        <w:t xml:space="preserve">    </w:t>
-      </w:r>
-      <w:proofErr w:type="spellStart"/>
-      <w:r>
-        <w:t>tt_no</w:t>
-      </w:r>
-      <w:proofErr w:type="spellEnd"/>
-      <w:r>
-        <w:t>,</w:t>
-      </w:r>
-    </w:p>
-    <w:p>
-      <w:r>
-        <w:t xml:space="preserve">    </w:t>
-      </w:r>
-      <w:proofErr w:type="spellStart"/>
-      <w:r>
-        <w:t>client_name</w:t>
-      </w:r>
-      <w:proofErr w:type="spellEnd"/>
-      <w:r>
-        <w:t>,</w:t>
-      </w:r>
-    </w:p>
-    <w:p>
-      <w:r>
-        <w:t xml:space="preserve">    </w:t>
-      </w:r>
-      <w:proofErr w:type="spellStart"/>
-      <w:r>
-        <w:t>fault_update_date_time</w:t>
-      </w:r>
-      <w:proofErr w:type="spellEnd"/>
-      <w:r>
-        <w:t>,</w:t>
-      </w:r>
-    </w:p>
-    <w:p>
-      <w:r>
-        <w:t xml:space="preserve">    </w:t>
-      </w:r>
-      <w:proofErr w:type="spellStart"/>
-      <w:r>
-        <w:t>tt_note</w:t>
-      </w:r>
-      <w:proofErr w:type="spellEnd"/>
-    </w:p>
-    <w:p>
-      <w:r>
-        <w:t xml:space="preserve">FROM </w:t>
-      </w:r>
-      <w:proofErr w:type="spellStart"/>
-      <w:r>
-        <w:t>public.stg_tt_updates</w:t>
-      </w:r>
-      <w:proofErr w:type="spellEnd"/>
-    </w:p>
-    <w:p>
-      <w:r>
-        <w:t>ORDER BY id::</w:t>
-      </w:r>
-      <w:proofErr w:type="spellStart"/>
-      <w:r>
-        <w:t>bigint</w:t>
-      </w:r>
-      <w:proofErr w:type="spellEnd"/>
-      <w:r>
-        <w:t xml:space="preserve"> DESC</w:t>
+        <w:t xml:space="preserve">    tt_no,</w:t>
+      </w:r>
+    </w:p>
+    <w:p>
+      <w:r>
+        <w:t xml:space="preserve">    client_name,</w:t>
+      </w:r>
+    </w:p>
+    <w:p>
+      <w:r>
+        <w:t xml:space="preserve">    fault_update_date_time,</w:t>
+      </w:r>
+    </w:p>
+    <w:p>
+      <w:r>
+        <w:t xml:space="preserve">    tt_note</w:t>
+      </w:r>
+    </w:p>
+    <w:p>
+      <w:r>
+        <w:t>FROM public.stg_tt_updates</w:t>
+      </w:r>
+    </w:p>
+    <w:p>
+      <w:r>
+        <w:t>ORDER BY id::bigint DESC</w:t>
       </w:r>
     </w:p>
     <w:p>
@@ -685,74 +552,32 @@
     </w:p>
     <w:p>
       <w:r>
-        <w:t xml:space="preserve">    </w:t>
-      </w:r>
-      <w:proofErr w:type="spellStart"/>
-      <w:r>
-        <w:t>tt_no</w:t>
-      </w:r>
-      <w:proofErr w:type="spellEnd"/>
-      <w:r>
-        <w:t>,</w:t>
-      </w:r>
-    </w:p>
-    <w:p>
-      <w:r>
-        <w:t xml:space="preserve">    </w:t>
-      </w:r>
-      <w:proofErr w:type="spellStart"/>
-      <w:r>
-        <w:t>client_name</w:t>
-      </w:r>
-      <w:proofErr w:type="spellEnd"/>
-      <w:r>
-        <w:t>,</w:t>
-      </w:r>
-    </w:p>
-    <w:p>
-      <w:r>
-        <w:t xml:space="preserve">    </w:t>
-      </w:r>
-      <w:proofErr w:type="spellStart"/>
-      <w:r>
-        <w:t>fault_update_date_time</w:t>
-      </w:r>
-      <w:proofErr w:type="spellEnd"/>
-      <w:r>
-        <w:t>,</w:t>
-      </w:r>
-    </w:p>
-    <w:p>
-      <w:r>
-        <w:t xml:space="preserve">    </w:t>
-      </w:r>
-      <w:proofErr w:type="spellStart"/>
-      <w:r>
-        <w:t>tt_note</w:t>
-      </w:r>
-      <w:proofErr w:type="spellEnd"/>
-    </w:p>
-    <w:p>
-      <w:r>
-        <w:t xml:space="preserve">FROM </w:t>
-      </w:r>
-      <w:proofErr w:type="spellStart"/>
-      <w:r>
-        <w:t>public.stg_tt_updates</w:t>
-      </w:r>
-      <w:proofErr w:type="spellEnd"/>
-    </w:p>
-    <w:p>
-      <w:r>
-        <w:t>ORDER BY id::</w:t>
-      </w:r>
-      <w:proofErr w:type="spellStart"/>
-      <w:r>
-        <w:t>bigint</w:t>
-      </w:r>
-      <w:proofErr w:type="spellEnd"/>
-      <w:r>
-        <w:t xml:space="preserve"> DESC</w:t>
+        <w:t xml:space="preserve">    tt_no,</w:t>
+      </w:r>
+    </w:p>
+    <w:p>
+      <w:r>
+        <w:t xml:space="preserve">    client_name,</w:t>
+      </w:r>
+    </w:p>
+    <w:p>
+      <w:r>
+        <w:t xml:space="preserve">    fault_update_date_time,</w:t>
+      </w:r>
+    </w:p>
+    <w:p>
+      <w:r>
+        <w:t xml:space="preserve">    tt_note</w:t>
+      </w:r>
+    </w:p>
+    <w:p>
+      <w:r>
+        <w:t>FROM public.stg_tt_updates</w:t>
+      </w:r>
+    </w:p>
+    <w:p>
+      <w:r>
+        <w:t>ORDER BY id::bigint DESC</w:t>
       </w:r>
     </w:p>
     <w:p>
@@ -810,35 +635,17 @@
     <w:p/>
     <w:p>
       <w:r>
-        <w:t xml:space="preserve">SELECT COUNT(*) AS </w:t>
-      </w:r>
-      <w:proofErr w:type="spellStart"/>
-      <w:r>
-        <w:t>decimal_tt_numbers</w:t>
-      </w:r>
-      <w:proofErr w:type="spellEnd"/>
-    </w:p>
-    <w:p>
-      <w:r>
-        <w:t xml:space="preserve">FROM </w:t>
-      </w:r>
-      <w:proofErr w:type="spellStart"/>
-      <w:r>
-        <w:t>public.stg_tt_updates</w:t>
-      </w:r>
-      <w:proofErr w:type="spellEnd"/>
-    </w:p>
-    <w:p>
-      <w:r>
-        <w:t xml:space="preserve">WHERE </w:t>
-      </w:r>
-      <w:proofErr w:type="spellStart"/>
-      <w:r>
-        <w:t>tt_no</w:t>
-      </w:r>
-      <w:proofErr w:type="spellEnd"/>
-      <w:r>
-        <w:t xml:space="preserve"> LIKE '%.0';</w:t>
+        <w:t>SELECT COUNT(*) AS decimal_tt_numbers</w:t>
+      </w:r>
+    </w:p>
+    <w:p>
+      <w:r>
+        <w:t>FROM public.stg_tt_updates</w:t>
+      </w:r>
+    </w:p>
+    <w:p>
+      <w:r>
+        <w:t>WHERE tt_no LIKE '%.0';</w:t>
       </w:r>
     </w:p>
     <w:p/>
@@ -887,25 +694,12 @@
     </w:p>
     <w:p>
       <w:r>
-        <w:t xml:space="preserve">        FROM </w:t>
-      </w:r>
-      <w:proofErr w:type="spellStart"/>
-      <w:r>
-        <w:t>public.stg_tt_reasons</w:t>
-      </w:r>
-      <w:proofErr w:type="spellEnd"/>
-    </w:p>
-    <w:p>
-      <w:r>
-        <w:t xml:space="preserve">    ) AS </w:t>
-      </w:r>
-      <w:proofErr w:type="spellStart"/>
-      <w:r>
-        <w:t>reason_rows</w:t>
-      </w:r>
-      <w:proofErr w:type="spellEnd"/>
-      <w:r>
-        <w:t>,</w:t>
+        <w:t xml:space="preserve">        FROM public.stg_tt_reasons</w:t>
+      </w:r>
+    </w:p>
+    <w:p>
+      <w:r>
+        <w:t xml:space="preserve">    ) AS reason_rows,</w:t>
       </w:r>
     </w:p>
     <w:p/>
@@ -921,25 +715,12 @@
     </w:p>
     <w:p>
       <w:r>
-        <w:t xml:space="preserve">        FROM </w:t>
-      </w:r>
-      <w:proofErr w:type="spellStart"/>
-      <w:r>
-        <w:t>public.stg_tt_updates</w:t>
-      </w:r>
-      <w:proofErr w:type="spellEnd"/>
-    </w:p>
-    <w:p>
-      <w:r>
-        <w:t xml:space="preserve">    ) AS </w:t>
-      </w:r>
-      <w:proofErr w:type="spellStart"/>
-      <w:r>
-        <w:t>update_rows</w:t>
-      </w:r>
-      <w:proofErr w:type="spellEnd"/>
-      <w:r>
-        <w:t>;</w:t>
+        <w:t xml:space="preserve">        FROM public.stg_tt_updates</w:t>
+      </w:r>
+    </w:p>
+    <w:p>
+      <w:r>
+        <w:t xml:space="preserve">    ) AS update_rows;</w:t>
       </w:r>
     </w:p>
     <w:p/>
@@ -965,61 +746,43 @@
           <w:bCs/>
         </w:rPr>
       </w:pPr>
-      <w:proofErr w:type="spellStart"/>
       <w:r>
         <w:rPr>
           <w:b/>
           <w:bCs/>
         </w:rPr>
-        <w:t>reason_rows</w:t>
-      </w:r>
-      <w:proofErr w:type="spellEnd"/>
-      <w:r>
+        <w:t>reason_rows = 430</w:t>
+      </w:r>
+    </w:p>
+    <w:p>
+      <w:pPr>
         <w:rPr>
           <w:b/>
           <w:bCs/>
         </w:rPr>
-        <w:t xml:space="preserve"> = 430</w:t>
-      </w:r>
-    </w:p>
-    <w:p>
-      <w:pPr>
+      </w:pPr>
+      <w:r>
         <w:rPr>
           <w:b/>
           <w:bCs/>
         </w:rPr>
-      </w:pPr>
-      <w:proofErr w:type="spellStart"/>
-      <w:r>
+        <w:t>update_rows = 18010</w:t>
+      </w:r>
+    </w:p>
+    <w:p/>
+    <w:p/>
+    <w:p>
+      <w:pPr>
         <w:rPr>
           <w:b/>
           <w:bCs/>
         </w:rPr>
-        <w:t>update_rows</w:t>
-      </w:r>
-      <w:proofErr w:type="spellEnd"/>
+      </w:pPr>
       <w:r>
         <w:rPr>
           <w:b/>
           <w:bCs/>
         </w:rPr>
-        <w:t xml:space="preserve"> = 18010</w:t>
-      </w:r>
-    </w:p>
-    <w:p/>
-    <w:p/>
-    <w:p>
-      <w:pPr>
-        <w:rPr>
-          <w:b/>
-          <w:bCs/>
-        </w:rPr>
-      </w:pPr>
-      <w:r>
-        <w:rPr>
-          <w:b/>
-          <w:bCs/>
-        </w:rPr>
         <w:t>Step 7 — Confirm both imports</w:t>
       </w:r>
     </w:p>
@@ -1045,25 +808,12 @@
     </w:p>
     <w:p>
       <w:r>
-        <w:t xml:space="preserve">        FROM </w:t>
-      </w:r>
-      <w:proofErr w:type="spellStart"/>
-      <w:r>
-        <w:t>public.stg_tt_reasons</w:t>
-      </w:r>
-      <w:proofErr w:type="spellEnd"/>
-    </w:p>
-    <w:p>
-      <w:r>
-        <w:t xml:space="preserve">    ) AS </w:t>
-      </w:r>
-      <w:proofErr w:type="spellStart"/>
-      <w:r>
-        <w:t>reason_rows</w:t>
-      </w:r>
-      <w:proofErr w:type="spellEnd"/>
-      <w:r>
-        <w:t>,</w:t>
+        <w:t xml:space="preserve">        FROM public.stg_tt_reasons</w:t>
+      </w:r>
+    </w:p>
+    <w:p>
+      <w:r>
+        <w:t xml:space="preserve">    ) AS reason_rows,</w:t>
       </w:r>
     </w:p>
     <w:p/>
@@ -1079,25 +829,12 @@
     </w:p>
     <w:p>
       <w:r>
-        <w:t xml:space="preserve">        FROM </w:t>
-      </w:r>
-      <w:proofErr w:type="spellStart"/>
-      <w:r>
-        <w:t>public.stg_tt_updates</w:t>
-      </w:r>
-      <w:proofErr w:type="spellEnd"/>
-    </w:p>
-    <w:p>
-      <w:r>
-        <w:t xml:space="preserve">    ) AS </w:t>
-      </w:r>
-      <w:proofErr w:type="spellStart"/>
-      <w:r>
-        <w:t>update_rows</w:t>
-      </w:r>
-      <w:proofErr w:type="spellEnd"/>
-      <w:r>
-        <w:t>;</w:t>
+        <w:t xml:space="preserve">        FROM public.stg_tt_updates</w:t>
+      </w:r>
+    </w:p>
+    <w:p>
+      <w:r>
+        <w:t xml:space="preserve">    ) AS update_rows;</w:t>
       </w:r>
     </w:p>
     <w:p>
@@ -1106,23 +843,13 @@
       </w:r>
     </w:p>
     <w:p>
-      <w:proofErr w:type="spellStart"/>
-      <w:r>
-        <w:t>reason_rows</w:t>
-      </w:r>
-      <w:proofErr w:type="spellEnd"/>
-      <w:r>
-        <w:t xml:space="preserve"> = 430</w:t>
-      </w:r>
-    </w:p>
-    <w:p>
-      <w:proofErr w:type="spellStart"/>
-      <w:r>
-        <w:t>update_rows</w:t>
-      </w:r>
-      <w:proofErr w:type="spellEnd"/>
-      <w:r>
-        <w:t xml:space="preserve"> = 18010</w:t>
+      <w:r>
+        <w:t>reason_rows = 430</w:t>
+      </w:r>
+    </w:p>
+    <w:p>
+      <w:r>
+        <w:t>update_rows = 18010</w:t>
       </w:r>
     </w:p>
     <w:p/>
@@ -1209,15 +936,7 @@
     </w:p>
     <w:p>
       <w:r>
-        <w:t xml:space="preserve">    ) AS </w:t>
-      </w:r>
-      <w:proofErr w:type="spellStart"/>
-      <w:r>
-        <w:t>backup_reason_rows</w:t>
-      </w:r>
-      <w:proofErr w:type="spellEnd"/>
-      <w:r>
-        <w:t>,</w:t>
+        <w:t xml:space="preserve">    ) AS backup_reason_rows,</w:t>
       </w:r>
     </w:p>
     <w:p/>
@@ -1238,15 +957,7 @@
     </w:p>
     <w:p>
       <w:r>
-        <w:t xml:space="preserve">    ) AS </w:t>
-      </w:r>
-      <w:proofErr w:type="spellStart"/>
-      <w:r>
-        <w:t>backup_update_rows</w:t>
-      </w:r>
-      <w:proofErr w:type="spellEnd"/>
-      <w:r>
-        <w:t>;</w:t>
+        <w:t xml:space="preserve">    ) AS backup_update_rows;</w:t>
       </w:r>
     </w:p>
     <w:p/>
@@ -1313,51 +1024,22 @@
     </w:p>
     <w:p>
       <w:r>
-        <w:t xml:space="preserve">        FROM </w:t>
-      </w:r>
-      <w:proofErr w:type="spellStart"/>
-      <w:r>
-        <w:t>public.tt_reasons</w:t>
-      </w:r>
-      <w:proofErr w:type="spellEnd"/>
-      <w:r>
-        <w:t xml:space="preserve"> AS final</w:t>
-      </w:r>
-    </w:p>
-    <w:p>
-      <w:r>
-        <w:t xml:space="preserve">        INNER JOIN </w:t>
-      </w:r>
-      <w:proofErr w:type="spellStart"/>
-      <w:r>
-        <w:t>public.stg_tt_reasons</w:t>
-      </w:r>
-      <w:proofErr w:type="spellEnd"/>
-      <w:r>
-        <w:t xml:space="preserve"> AS staging</w:t>
-      </w:r>
-    </w:p>
-    <w:p>
-      <w:r>
-        <w:t xml:space="preserve">            ON final.id = NULLIF(BTRIM(staging.id), '')::</w:t>
-      </w:r>
-      <w:proofErr w:type="spellStart"/>
-      <w:r>
-        <w:t>bigint</w:t>
-      </w:r>
-      <w:proofErr w:type="spellEnd"/>
-    </w:p>
-    <w:p>
-      <w:r>
-        <w:t xml:space="preserve">    ) AS </w:t>
-      </w:r>
-      <w:proofErr w:type="spellStart"/>
-      <w:r>
-        <w:t>migrated_reason_rows</w:t>
-      </w:r>
-      <w:proofErr w:type="spellEnd"/>
-      <w:r>
-        <w:t>,</w:t>
+        <w:t xml:space="preserve">        FROM public.tt_reasons AS final</w:t>
+      </w:r>
+    </w:p>
+    <w:p>
+      <w:r>
+        <w:t xml:space="preserve">        INNER JOIN public.stg_tt_reasons AS staging</w:t>
+      </w:r>
+    </w:p>
+    <w:p>
+      <w:r>
+        <w:t xml:space="preserve">            ON final.id = NULLIF(BTRIM(staging.id), '')::bigint</w:t>
+      </w:r>
+    </w:p>
+    <w:p>
+      <w:r>
+        <w:t xml:space="preserve">    ) AS migrated_reason_rows,</w:t>
       </w:r>
     </w:p>
     <w:p/>
@@ -1373,51 +1055,22 @@
     </w:p>
     <w:p>
       <w:r>
-        <w:t xml:space="preserve">        FROM </w:t>
-      </w:r>
-      <w:proofErr w:type="spellStart"/>
-      <w:r>
-        <w:t>public.tt_updates</w:t>
-      </w:r>
-      <w:proofErr w:type="spellEnd"/>
-      <w:r>
-        <w:t xml:space="preserve"> AS final</w:t>
-      </w:r>
-    </w:p>
-    <w:p>
-      <w:r>
-        <w:t xml:space="preserve">        INNER JOIN </w:t>
-      </w:r>
-      <w:proofErr w:type="spellStart"/>
-      <w:r>
-        <w:t>public.stg_tt_updates</w:t>
-      </w:r>
-      <w:proofErr w:type="spellEnd"/>
-      <w:r>
-        <w:t xml:space="preserve"> AS staging</w:t>
-      </w:r>
-    </w:p>
-    <w:p>
-      <w:r>
-        <w:t xml:space="preserve">            ON final.id = NULLIF(BTRIM(staging.id), '')::</w:t>
-      </w:r>
-      <w:proofErr w:type="spellStart"/>
-      <w:r>
-        <w:t>bigint</w:t>
-      </w:r>
-      <w:proofErr w:type="spellEnd"/>
-    </w:p>
-    <w:p>
-      <w:r>
-        <w:t xml:space="preserve">    ) AS </w:t>
-      </w:r>
-      <w:proofErr w:type="spellStart"/>
-      <w:r>
-        <w:t>migrated_update_rows</w:t>
-      </w:r>
-      <w:proofErr w:type="spellEnd"/>
-      <w:r>
-        <w:t>;</w:t>
+        <w:t xml:space="preserve">        FROM public.tt_updates AS final</w:t>
+      </w:r>
+    </w:p>
+    <w:p>
+      <w:r>
+        <w:t xml:space="preserve">        INNER JOIN public.stg_tt_updates AS staging</w:t>
+      </w:r>
+    </w:p>
+    <w:p>
+      <w:r>
+        <w:t xml:space="preserve">            ON final.id = NULLIF(BTRIM(staging.id), '')::bigint</w:t>
+      </w:r>
+    </w:p>
+    <w:p>
+      <w:r>
+        <w:t xml:space="preserve">    ) AS migrated_update_rows;</w:t>
       </w:r>
     </w:p>
     <w:p/>
@@ -1537,87 +1190,37 @@
     </w:p>
     <w:p>
       <w:r>
-        <w:t xml:space="preserve">    </w:t>
-      </w:r>
-      <w:proofErr w:type="spellStart"/>
-      <w:r>
-        <w:t>trouble_ticket_id</w:t>
-      </w:r>
-      <w:proofErr w:type="spellEnd"/>
-      <w:r>
-        <w:t>,</w:t>
-      </w:r>
-    </w:p>
-    <w:p>
-      <w:r>
-        <w:t xml:space="preserve">    </w:t>
-      </w:r>
-      <w:proofErr w:type="spellStart"/>
-      <w:r>
-        <w:t>tt_no</w:t>
-      </w:r>
-      <w:proofErr w:type="spellEnd"/>
-      <w:r>
-        <w:t>,</w:t>
-      </w:r>
-    </w:p>
-    <w:p>
-      <w:r>
-        <w:t xml:space="preserve">    </w:t>
-      </w:r>
-      <w:proofErr w:type="spellStart"/>
-      <w:r>
-        <w:t>approved_val</w:t>
-      </w:r>
-      <w:proofErr w:type="spellEnd"/>
-      <w:r>
-        <w:t>,</w:t>
-      </w:r>
-    </w:p>
-    <w:p>
-      <w:r>
-        <w:t xml:space="preserve">    </w:t>
-      </w:r>
-      <w:proofErr w:type="spellStart"/>
-      <w:r>
-        <w:t>delivered_val</w:t>
-      </w:r>
-      <w:proofErr w:type="spellEnd"/>
-      <w:r>
-        <w:t>,</w:t>
-      </w:r>
-    </w:p>
-    <w:p>
-      <w:r>
-        <w:t xml:space="preserve">    </w:t>
-      </w:r>
-      <w:proofErr w:type="spellStart"/>
-      <w:r>
-        <w:t>created_at</w:t>
-      </w:r>
-      <w:proofErr w:type="spellEnd"/>
-    </w:p>
-    <w:p>
-      <w:r>
-        <w:t xml:space="preserve">FROM </w:t>
-      </w:r>
-      <w:proofErr w:type="spellStart"/>
-      <w:r>
-        <w:t>public.tt_reasons</w:t>
-      </w:r>
-      <w:proofErr w:type="spellEnd"/>
-    </w:p>
-    <w:p>
-      <w:r>
-        <w:t>WHERE BTRIM(</w:t>
-      </w:r>
-      <w:proofErr w:type="spellStart"/>
-      <w:r>
-        <w:t>tt_no</w:t>
-      </w:r>
-      <w:proofErr w:type="spellEnd"/>
-      <w:r>
-        <w:t>) = '2026072129719'</w:t>
+        <w:t xml:space="preserve">    trouble_ticket_id,</w:t>
+      </w:r>
+    </w:p>
+    <w:p>
+      <w:r>
+        <w:t xml:space="preserve">    tt_no,</w:t>
+      </w:r>
+    </w:p>
+    <w:p>
+      <w:r>
+        <w:t xml:space="preserve">    approved_val,</w:t>
+      </w:r>
+    </w:p>
+    <w:p>
+      <w:r>
+        <w:t xml:space="preserve">    delivered_val,</w:t>
+      </w:r>
+    </w:p>
+    <w:p>
+      <w:r>
+        <w:t xml:space="preserve">    created_at</w:t>
+      </w:r>
+    </w:p>
+    <w:p>
+      <w:r>
+        <w:t>FROM public.tt_reasons</w:t>
+      </w:r>
+    </w:p>
+    <w:p>
+      <w:r>
+        <w:t>WHERE BTRIM(tt_no) = '2026072129719'</w:t>
       </w:r>
     </w:p>
     <w:p>
@@ -1627,15 +1230,7 @@
     </w:p>
     <w:p>
       <w:r>
-        <w:t xml:space="preserve">    </w:t>
-      </w:r>
-      <w:proofErr w:type="spellStart"/>
-      <w:r>
-        <w:t>created_at</w:t>
-      </w:r>
-      <w:proofErr w:type="spellEnd"/>
-      <w:r>
-        <w:t xml:space="preserve"> DESC NULLS LAST,</w:t>
+        <w:t xml:space="preserve">    created_at DESC NULLS LAST,</w:t>
       </w:r>
     </w:p>
     <w:p>
@@ -1652,23 +1247,13 @@
       </w:r>
     </w:p>
     <w:p>
-      <w:proofErr w:type="spellStart"/>
-      <w:r>
-        <w:t>approved_val</w:t>
-      </w:r>
-      <w:proofErr w:type="spellEnd"/>
-      <w:r>
-        <w:t xml:space="preserve">  = 1</w:t>
-      </w:r>
-    </w:p>
-    <w:p>
-      <w:proofErr w:type="spellStart"/>
-      <w:r>
-        <w:t>delivered_val</w:t>
-      </w:r>
-      <w:proofErr w:type="spellEnd"/>
-      <w:r>
-        <w:t xml:space="preserve"> = 0</w:t>
+      <w:r>
+        <w:t>approved_val  = 1</w:t>
+      </w:r>
+    </w:p>
+    <w:p>
+      <w:r>
+        <w:t>delivered_val = 0</w:t>
       </w:r>
     </w:p>
     <w:p/>
@@ -1680,126 +1265,52 @@
     </w:p>
     <w:p>
       <w:r>
-        <w:t xml:space="preserve">    </w:t>
-      </w:r>
-      <w:proofErr w:type="spellStart"/>
-      <w:r>
-        <w:t>indexname</w:t>
-      </w:r>
-      <w:proofErr w:type="spellEnd"/>
-      <w:r>
-        <w:t>,</w:t>
-      </w:r>
-    </w:p>
-    <w:p>
-      <w:r>
-        <w:t xml:space="preserve">    </w:t>
-      </w:r>
-      <w:proofErr w:type="spellStart"/>
-      <w:r>
-        <w:t>tablename</w:t>
-      </w:r>
-      <w:proofErr w:type="spellEnd"/>
-    </w:p>
-    <w:p>
-      <w:r>
-        <w:t xml:space="preserve">FROM </w:t>
-      </w:r>
-      <w:proofErr w:type="spellStart"/>
-      <w:r>
-        <w:t>pg_indexes</w:t>
-      </w:r>
-      <w:proofErr w:type="spellEnd"/>
-    </w:p>
-    <w:p>
-      <w:r>
-        <w:t xml:space="preserve">WHERE </w:t>
-      </w:r>
-      <w:proofErr w:type="spellStart"/>
-      <w:r>
-        <w:t>schemaname</w:t>
-      </w:r>
-      <w:proofErr w:type="spellEnd"/>
-      <w:r>
-        <w:t xml:space="preserve"> = 'public'</w:t>
-      </w:r>
-    </w:p>
-    <w:p>
-      <w:r>
-        <w:t xml:space="preserve">  AND </w:t>
-      </w:r>
-      <w:proofErr w:type="spellStart"/>
-      <w:r>
-        <w:t>indexname</w:t>
-      </w:r>
-      <w:proofErr w:type="spellEnd"/>
-      <w:r>
-        <w:t xml:space="preserve"> IN (</w:t>
-      </w:r>
-    </w:p>
-    <w:p>
-      <w:r>
-        <w:t xml:space="preserve">      '</w:t>
-      </w:r>
-      <w:proofErr w:type="spellStart"/>
-      <w:r>
-        <w:t>idx_tt_reasons_tt_no</w:t>
-      </w:r>
-      <w:proofErr w:type="spellEnd"/>
-      <w:r>
-        <w:t>',</w:t>
-      </w:r>
-    </w:p>
-    <w:p>
-      <w:r>
-        <w:t xml:space="preserve">      '</w:t>
-      </w:r>
-      <w:proofErr w:type="spellStart"/>
-      <w:r>
-        <w:t>idx_tt_reasons_trouble_ticket_id</w:t>
-      </w:r>
-      <w:proofErr w:type="spellEnd"/>
-      <w:r>
-        <w:t>',</w:t>
-      </w:r>
-    </w:p>
-    <w:p>
-      <w:r>
-        <w:t xml:space="preserve">      '</w:t>
-      </w:r>
-      <w:proofErr w:type="spellStart"/>
-      <w:r>
-        <w:t>idx_tt_updates_tt_no</w:t>
-      </w:r>
-      <w:proofErr w:type="spellEnd"/>
-      <w:r>
-        <w:t>',</w:t>
-      </w:r>
-    </w:p>
-    <w:p>
-      <w:r>
-        <w:t xml:space="preserve">      '</w:t>
-      </w:r>
-      <w:proofErr w:type="spellStart"/>
-      <w:r>
-        <w:t>idx_tt_updates_trouble_ticket_id</w:t>
-      </w:r>
-      <w:proofErr w:type="spellEnd"/>
-      <w:r>
-        <w:t>',</w:t>
-      </w:r>
-    </w:p>
-    <w:p>
-      <w:r>
-        <w:t xml:space="preserve">      '</w:t>
-      </w:r>
-      <w:proofErr w:type="spellStart"/>
-      <w:r>
-        <w:t>idx_tt_updates_fault_update_date_time</w:t>
-      </w:r>
-      <w:proofErr w:type="spellEnd"/>
-      <w:r>
-        <w:t>'</w:t>
+        <w:t xml:space="preserve">    indexname,</w:t>
+      </w:r>
+    </w:p>
+    <w:p>
+      <w:r>
+        <w:t xml:space="preserve">    tablename</w:t>
+      </w:r>
+    </w:p>
+    <w:p>
+      <w:r>
+        <w:t>FROM pg_indexes</w:t>
+      </w:r>
+    </w:p>
+    <w:p>
+      <w:r>
+        <w:t>WHERE schemaname = 'public'</w:t>
+      </w:r>
+    </w:p>
+    <w:p>
+      <w:r>
+        <w:t xml:space="preserve">  AND indexname IN (</w:t>
+      </w:r>
+    </w:p>
+    <w:p>
+      <w:r>
+        <w:t xml:space="preserve">      'idx_tt_reasons_tt_no',</w:t>
+      </w:r>
+    </w:p>
+    <w:p>
+      <w:r>
+        <w:t xml:space="preserve">      'idx_tt_reasons_trouble_ticket_id',</w:t>
+      </w:r>
+    </w:p>
+    <w:p>
+      <w:r>
+        <w:t xml:space="preserve">      'idx_tt_updates_tt_no',</w:t>
+      </w:r>
+    </w:p>
+    <w:p>
+      <w:r>
+        <w:t xml:space="preserve">      'idx_tt_updates_trouble_ticket_id',</w:t>
+      </w:r>
+    </w:p>
+    <w:p>
+      <w:r>
+        <w:t xml:space="preserve">      'idx_tt_updates_fault_update_date_time'</w:t>
       </w:r>
     </w:p>
     <w:p>
@@ -1809,15 +1320,7 @@
     </w:p>
     <w:p>
       <w:r>
-        <w:t xml:space="preserve">ORDER BY </w:t>
-      </w:r>
-      <w:proofErr w:type="spellStart"/>
-      <w:r>
-        <w:t>indexname</w:t>
-      </w:r>
-      <w:proofErr w:type="spellEnd"/>
-      <w:r>
-        <w:t>;</w:t>
+        <w:t>ORDER BY indexname;</w:t>
       </w:r>
     </w:p>
     <w:p/>
@@ -1891,127 +1394,37 @@
     </w:p>
     <w:p>
       <w:r>
-        <w:t xml:space="preserve">    </w:t>
-      </w:r>
-      <w:proofErr w:type="spellStart"/>
-      <w:r>
-        <w:t>conname</w:t>
-      </w:r>
-      <w:proofErr w:type="spellEnd"/>
-      <w:r>
-        <w:t xml:space="preserve"> AS </w:t>
-      </w:r>
-      <w:proofErr w:type="spellStart"/>
-      <w:r>
-        <w:t>constraint_name</w:t>
-      </w:r>
-      <w:proofErr w:type="spellEnd"/>
-      <w:r>
-        <w:t>,</w:t>
-      </w:r>
-    </w:p>
-    <w:p>
-      <w:r>
-        <w:t xml:space="preserve">    </w:t>
-      </w:r>
-      <w:proofErr w:type="spellStart"/>
-      <w:r>
-        <w:t>conrelid</w:t>
-      </w:r>
-      <w:proofErr w:type="spellEnd"/>
-      <w:r>
-        <w:t>::</w:t>
-      </w:r>
-      <w:proofErr w:type="spellStart"/>
-      <w:r>
-        <w:t>regclass</w:t>
-      </w:r>
-      <w:proofErr w:type="spellEnd"/>
-      <w:r>
-        <w:t xml:space="preserve"> AS </w:t>
-      </w:r>
-      <w:proofErr w:type="spellStart"/>
-      <w:r>
-        <w:t>table_name</w:t>
-      </w:r>
-      <w:proofErr w:type="spellEnd"/>
-      <w:r>
-        <w:t>,</w:t>
-      </w:r>
-    </w:p>
-    <w:p>
-      <w:r>
-        <w:t xml:space="preserve">    </w:t>
-      </w:r>
-      <w:proofErr w:type="spellStart"/>
-      <w:r>
-        <w:t>confrelid</w:t>
-      </w:r>
-      <w:proofErr w:type="spellEnd"/>
-      <w:r>
-        <w:t>::</w:t>
-      </w:r>
-      <w:proofErr w:type="spellStart"/>
-      <w:r>
-        <w:t>regclass</w:t>
-      </w:r>
-      <w:proofErr w:type="spellEnd"/>
-      <w:r>
-        <w:t xml:space="preserve"> AS </w:t>
-      </w:r>
-      <w:proofErr w:type="spellStart"/>
-      <w:r>
-        <w:t>referenced_table</w:t>
-      </w:r>
-      <w:proofErr w:type="spellEnd"/>
-    </w:p>
-    <w:p>
-      <w:r>
-        <w:t xml:space="preserve">FROM </w:t>
-      </w:r>
-      <w:proofErr w:type="spellStart"/>
-      <w:r>
-        <w:t>pg_constraint</w:t>
-      </w:r>
-      <w:proofErr w:type="spellEnd"/>
-    </w:p>
-    <w:p>
-      <w:r>
-        <w:t xml:space="preserve">WHERE </w:t>
-      </w:r>
-      <w:proofErr w:type="spellStart"/>
-      <w:r>
-        <w:t>conname</w:t>
-      </w:r>
-      <w:proofErr w:type="spellEnd"/>
-      <w:r>
-        <w:t xml:space="preserve"> IN (</w:t>
-      </w:r>
-    </w:p>
-    <w:p>
-      <w:r>
-        <w:t xml:space="preserve">    '</w:t>
-      </w:r>
-      <w:proofErr w:type="spellStart"/>
-      <w:r>
-        <w:t>fk_tt_reasons_trouble_ticket</w:t>
-      </w:r>
-      <w:proofErr w:type="spellEnd"/>
-      <w:r>
-        <w:t>',</w:t>
-      </w:r>
-    </w:p>
-    <w:p>
-      <w:r>
-        <w:t xml:space="preserve">    '</w:t>
-      </w:r>
-      <w:proofErr w:type="spellStart"/>
-      <w:r>
-        <w:t>fk_tt_updates_trouble_ticket</w:t>
-      </w:r>
-      <w:proofErr w:type="spellEnd"/>
-      <w:r>
-        <w:t>'</w:t>
+        <w:t xml:space="preserve">    conname AS constraint_name,</w:t>
+      </w:r>
+    </w:p>
+    <w:p>
+      <w:r>
+        <w:t xml:space="preserve">    conrelid::regclass AS table_name,</w:t>
+      </w:r>
+    </w:p>
+    <w:p>
+      <w:r>
+        <w:t xml:space="preserve">    confrelid::regclass AS referenced_table</w:t>
+      </w:r>
+    </w:p>
+    <w:p>
+      <w:r>
+        <w:t>FROM pg_constraint</w:t>
+      </w:r>
+    </w:p>
+    <w:p>
+      <w:r>
+        <w:t>WHERE conname IN (</w:t>
+      </w:r>
+    </w:p>
+    <w:p>
+      <w:r>
+        <w:t xml:space="preserve">    'fk_tt_reasons_trouble_ticket',</w:t>
+      </w:r>
+    </w:p>
+    <w:p>
+      <w:r>
+        <w:t xml:space="preserve">    'fk_tt_updates_trouble_ticket'</w:t>
       </w:r>
     </w:p>
     <w:p>
@@ -2079,41 +1492,20 @@
     </w:p>
     <w:p>
       <w:r>
-        <w:t xml:space="preserve">    </w:t>
-      </w:r>
-      <w:proofErr w:type="spellStart"/>
-      <w:r>
-        <w:t>ticket.tt_no</w:t>
-      </w:r>
-      <w:proofErr w:type="spellEnd"/>
-      <w:r>
-        <w:t>,</w:t>
-      </w:r>
-    </w:p>
-    <w:p/>
-    <w:p>
-      <w:r>
-        <w:t xml:space="preserve">    </w:t>
-      </w:r>
-      <w:proofErr w:type="spellStart"/>
-      <w:r>
-        <w:t>reason.approved_val</w:t>
-      </w:r>
-      <w:proofErr w:type="spellEnd"/>
-      <w:r>
-        <w:t>,</w:t>
-      </w:r>
-    </w:p>
-    <w:p/>
-    <w:p>
-      <w:r>
-        <w:t xml:space="preserve">    CASE </w:t>
-      </w:r>
-      <w:proofErr w:type="spellStart"/>
-      <w:r>
-        <w:t>reason.approved_val</w:t>
-      </w:r>
-      <w:proofErr w:type="spellEnd"/>
+        <w:t xml:space="preserve">    ticket.tt_no,</w:t>
+      </w:r>
+    </w:p>
+    <w:p/>
+    <w:p>
+      <w:r>
+        <w:t xml:space="preserve">    reason.approved_val,</w:t>
+      </w:r>
+    </w:p>
+    <w:p/>
+    <w:p>
+      <w:r>
+        <w:t xml:space="preserve">    CASE reason.approved_val</w:t>
+      </w:r>
     </w:p>
     <w:p>
       <w:r>
@@ -2137,41 +1529,20 @@
     </w:p>
     <w:p>
       <w:r>
-        <w:t xml:space="preserve">    END AS </w:t>
-      </w:r>
-      <w:proofErr w:type="spellStart"/>
-      <w:r>
-        <w:t>requisition_type</w:t>
-      </w:r>
-      <w:proofErr w:type="spellEnd"/>
-      <w:r>
-        <w:t>,</w:t>
-      </w:r>
-    </w:p>
-    <w:p/>
-    <w:p>
-      <w:r>
-        <w:t xml:space="preserve">    </w:t>
-      </w:r>
-      <w:proofErr w:type="spellStart"/>
-      <w:r>
-        <w:t>reason.delivered_val</w:t>
-      </w:r>
-      <w:proofErr w:type="spellEnd"/>
-      <w:r>
-        <w:t>,</w:t>
-      </w:r>
-    </w:p>
-    <w:p/>
-    <w:p>
-      <w:r>
-        <w:t xml:space="preserve">    CASE </w:t>
-      </w:r>
-      <w:proofErr w:type="spellStart"/>
-      <w:r>
-        <w:t>reason.delivered_val</w:t>
-      </w:r>
-      <w:proofErr w:type="spellEnd"/>
+        <w:t xml:space="preserve">    END AS requisition_type,</w:t>
+      </w:r>
+    </w:p>
+    <w:p/>
+    <w:p>
+      <w:r>
+        <w:t xml:space="preserve">    reason.delivered_val,</w:t>
+      </w:r>
+    </w:p>
+    <w:p/>
+    <w:p>
+      <w:r>
+        <w:t xml:space="preserve">    CASE reason.delivered_val</w:t>
+      </w:r>
     </w:p>
     <w:p>
       <w:r>
@@ -2195,69 +1566,24 @@
     </w:p>
     <w:p>
       <w:r>
-        <w:t xml:space="preserve">    END AS </w:t>
-      </w:r>
-      <w:proofErr w:type="spellStart"/>
-      <w:r>
-        <w:t>delivered_status</w:t>
-      </w:r>
-      <w:proofErr w:type="spellEnd"/>
-      <w:r>
-        <w:t>,</w:t>
-      </w:r>
-    </w:p>
-    <w:p/>
-    <w:p>
-      <w:r>
-        <w:t xml:space="preserve">    </w:t>
-      </w:r>
-      <w:proofErr w:type="spellStart"/>
-      <w:r>
-        <w:t>latest_update.tt_note</w:t>
-      </w:r>
-      <w:proofErr w:type="spellEnd"/>
-      <w:r>
-        <w:t xml:space="preserve"> AS </w:t>
-      </w:r>
-      <w:proofErr w:type="spellStart"/>
-      <w:r>
-        <w:t>latest_update_note</w:t>
-      </w:r>
-      <w:proofErr w:type="spellEnd"/>
-      <w:r>
-        <w:t>,</w:t>
-      </w:r>
-    </w:p>
-    <w:p>
-      <w:r>
-        <w:t xml:space="preserve">    </w:t>
-      </w:r>
-      <w:proofErr w:type="spellStart"/>
-      <w:r>
-        <w:t>latest_update.fault_update_date_time</w:t>
-      </w:r>
-      <w:proofErr w:type="spellEnd"/>
-      <w:r>
-        <w:t xml:space="preserve"> AS </w:t>
-      </w:r>
-      <w:proofErr w:type="spellStart"/>
-      <w:r>
-        <w:t>latest_update_at</w:t>
-      </w:r>
-      <w:proofErr w:type="spellEnd"/>
-    </w:p>
-    <w:p/>
-    <w:p>
-      <w:r>
-        <w:t xml:space="preserve">FROM </w:t>
-      </w:r>
-      <w:proofErr w:type="spellStart"/>
-      <w:r>
-        <w:t>public.trouble_tickets</w:t>
-      </w:r>
-      <w:proofErr w:type="spellEnd"/>
-      <w:r>
-        <w:t xml:space="preserve"> AS ticket</w:t>
+        <w:t xml:space="preserve">    END AS delivered_status,</w:t>
+      </w:r>
+    </w:p>
+    <w:p/>
+    <w:p>
+      <w:r>
+        <w:t xml:space="preserve">    latest_update.tt_note AS latest_update_note,</w:t>
+      </w:r>
+    </w:p>
+    <w:p>
+      <w:r>
+        <w:t xml:space="preserve">    latest_update.fault_update_date_time AS latest_update_at</w:t>
+      </w:r>
+    </w:p>
+    <w:p/>
+    <w:p>
+      <w:r>
+        <w:t>FROM public.trouble_tickets AS ticket</w:t>
       </w:r>
     </w:p>
     <w:p/>
@@ -2273,56 +1599,22 @@
     </w:p>
     <w:p>
       <w:r>
-        <w:t xml:space="preserve">        </w:t>
-      </w:r>
-      <w:proofErr w:type="spellStart"/>
-      <w:r>
-        <w:t>tt_reason.approved_val</w:t>
-      </w:r>
-      <w:proofErr w:type="spellEnd"/>
-      <w:r>
-        <w:t>,</w:t>
-      </w:r>
-    </w:p>
-    <w:p>
-      <w:r>
-        <w:t xml:space="preserve">        </w:t>
-      </w:r>
-      <w:proofErr w:type="spellStart"/>
-      <w:r>
-        <w:t>tt_reason.delivered_val</w:t>
-      </w:r>
-      <w:proofErr w:type="spellEnd"/>
-    </w:p>
-    <w:p>
-      <w:r>
-        <w:t xml:space="preserve">    FROM </w:t>
-      </w:r>
-      <w:proofErr w:type="spellStart"/>
-      <w:r>
-        <w:t>public.tt_reasons</w:t>
-      </w:r>
-      <w:proofErr w:type="spellEnd"/>
-      <w:r>
-        <w:t xml:space="preserve"> AS </w:t>
-      </w:r>
-      <w:proofErr w:type="spellStart"/>
-      <w:r>
-        <w:t>tt_reason</w:t>
-      </w:r>
-      <w:proofErr w:type="spellEnd"/>
-    </w:p>
-    <w:p>
-      <w:r>
-        <w:t xml:space="preserve">    WHERE </w:t>
-      </w:r>
-      <w:proofErr w:type="spellStart"/>
-      <w:r>
-        <w:t>tt_reason.trouble_ticket_id</w:t>
-      </w:r>
-      <w:proofErr w:type="spellEnd"/>
-      <w:r>
-        <w:t xml:space="preserve"> = ticket.id</w:t>
+        <w:t xml:space="preserve">        tt_reason.approved_val,</w:t>
+      </w:r>
+    </w:p>
+    <w:p>
+      <w:r>
+        <w:t xml:space="preserve">        tt_reason.delivered_val</w:t>
+      </w:r>
+    </w:p>
+    <w:p>
+      <w:r>
+        <w:t xml:space="preserve">    FROM public.tt_reasons AS tt_reason</w:t>
+      </w:r>
+    </w:p>
+    <w:p>
+      <w:r>
+        <w:t xml:space="preserve">    WHERE tt_reason.trouble_ticket_id = ticket.id</w:t>
       </w:r>
     </w:p>
     <w:p>
@@ -2332,15 +1624,7 @@
     </w:p>
     <w:p>
       <w:r>
-        <w:t xml:space="preserve">        </w:t>
-      </w:r>
-      <w:proofErr w:type="spellStart"/>
-      <w:r>
-        <w:t>tt_reason.created_at</w:t>
-      </w:r>
-      <w:proofErr w:type="spellEnd"/>
-      <w:r>
-        <w:t xml:space="preserve"> DESC NULLS LAST,</w:t>
+        <w:t xml:space="preserve">        tt_reason.created_at DESC NULLS LAST,</w:t>
       </w:r>
     </w:p>
     <w:p>
@@ -2371,56 +1655,22 @@
     </w:p>
     <w:p>
       <w:r>
-        <w:t xml:space="preserve">        </w:t>
-      </w:r>
-      <w:proofErr w:type="spellStart"/>
-      <w:r>
-        <w:t>tt_update.tt_note</w:t>
-      </w:r>
-      <w:proofErr w:type="spellEnd"/>
-      <w:r>
-        <w:t>,</w:t>
-      </w:r>
-    </w:p>
-    <w:p>
-      <w:r>
-        <w:t xml:space="preserve">        </w:t>
-      </w:r>
-      <w:proofErr w:type="spellStart"/>
-      <w:r>
-        <w:t>tt_update.fault_update_date_time</w:t>
-      </w:r>
-      <w:proofErr w:type="spellEnd"/>
-    </w:p>
-    <w:p>
-      <w:r>
-        <w:t xml:space="preserve">    FROM </w:t>
-      </w:r>
-      <w:proofErr w:type="spellStart"/>
-      <w:r>
-        <w:t>public.tt_updates</w:t>
-      </w:r>
-      <w:proofErr w:type="spellEnd"/>
-      <w:r>
-        <w:t xml:space="preserve"> AS </w:t>
-      </w:r>
-      <w:proofErr w:type="spellStart"/>
-      <w:r>
-        <w:t>tt_update</w:t>
-      </w:r>
-      <w:proofErr w:type="spellEnd"/>
-    </w:p>
-    <w:p>
-      <w:r>
-        <w:t xml:space="preserve">    WHERE </w:t>
-      </w:r>
-      <w:proofErr w:type="spellStart"/>
-      <w:r>
-        <w:t>tt_update.trouble_ticket_id</w:t>
-      </w:r>
-      <w:proofErr w:type="spellEnd"/>
-      <w:r>
-        <w:t xml:space="preserve"> = ticket.id</w:t>
+        <w:t xml:space="preserve">        tt_update.tt_note,</w:t>
+      </w:r>
+    </w:p>
+    <w:p>
+      <w:r>
+        <w:t xml:space="preserve">        tt_update.fault_update_date_time</w:t>
+      </w:r>
+    </w:p>
+    <w:p>
+      <w:r>
+        <w:t xml:space="preserve">    FROM public.tt_updates AS tt_update</w:t>
+      </w:r>
+    </w:p>
+    <w:p>
+      <w:r>
+        <w:t xml:space="preserve">    WHERE tt_update.trouble_ticket_id = ticket.id</w:t>
       </w:r>
     </w:p>
     <w:p>
@@ -2430,15 +1680,7 @@
     </w:p>
     <w:p>
       <w:r>
-        <w:t xml:space="preserve">        </w:t>
-      </w:r>
-      <w:proofErr w:type="spellStart"/>
-      <w:r>
-        <w:t>tt_update.fault_update_date_time</w:t>
-      </w:r>
-      <w:proofErr w:type="spellEnd"/>
-      <w:r>
-        <w:t xml:space="preserve"> DESC NULLS LAST,</w:t>
+        <w:t xml:space="preserve">        tt_update.fault_update_date_time DESC NULLS LAST,</w:t>
       </w:r>
     </w:p>
     <w:p>
@@ -2453,29 +1695,13 @@
     </w:p>
     <w:p>
       <w:r>
-        <w:t xml:space="preserve">) AS </w:t>
-      </w:r>
-      <w:proofErr w:type="spellStart"/>
-      <w:r>
-        <w:t>latest_update</w:t>
-      </w:r>
-      <w:proofErr w:type="spellEnd"/>
-      <w:r>
-        <w:t xml:space="preserve"> ON TRUE</w:t>
-      </w:r>
-    </w:p>
-    <w:p/>
-    <w:p>
-      <w:r>
-        <w:t>WHERE BTRIM(</w:t>
-      </w:r>
-      <w:proofErr w:type="spellStart"/>
-      <w:r>
-        <w:t>ticket.tt_no</w:t>
-      </w:r>
-      <w:proofErr w:type="spellEnd"/>
-      <w:r>
-        <w:t>::text) = '2026072129719';</w:t>
+        <w:t>) AS latest_update ON TRUE</w:t>
+      </w:r>
+    </w:p>
+    <w:p/>
+    <w:p>
+      <w:r>
+        <w:t>WHERE BTRIM(ticket.tt_no::text) = '2026072129719';</w:t>
       </w:r>
     </w:p>
     <w:p/>
@@ -2577,67 +1803,27 @@
     </w:p>
     <w:p>
       <w:r>
-        <w:t>            "</w:t>
-      </w:r>
-      <w:proofErr w:type="spellStart"/>
-      <w:r>
-        <w:t>tt_no</w:t>
-      </w:r>
-      <w:proofErr w:type="spellEnd"/>
-      <w:r>
-        <w:t>": "2026072129719",</w:t>
-      </w:r>
-    </w:p>
-    <w:p>
-      <w:r>
-        <w:t>            "</w:t>
-      </w:r>
-      <w:proofErr w:type="spellStart"/>
-      <w:r>
-        <w:t>employee_id</w:t>
-      </w:r>
-      <w:proofErr w:type="spellEnd"/>
-      <w:r>
-        <w:t>": "02-2052",</w:t>
-      </w:r>
-    </w:p>
-    <w:p>
-      <w:r>
-        <w:t>            "</w:t>
-      </w:r>
-      <w:proofErr w:type="spellStart"/>
-      <w:r>
-        <w:t>employee_name</w:t>
-      </w:r>
-      <w:proofErr w:type="spellEnd"/>
-      <w:r>
-        <w:t>": "Saumitro Kumer Sarder",</w:t>
-      </w:r>
-    </w:p>
-    <w:p>
-      <w:r>
-        <w:t>            "</w:t>
-      </w:r>
-      <w:proofErr w:type="spellStart"/>
-      <w:r>
-        <w:t>assigned_id</w:t>
-      </w:r>
-      <w:proofErr w:type="spellEnd"/>
-      <w:r>
-        <w:t>": "",</w:t>
-      </w:r>
-    </w:p>
-    <w:p>
-      <w:r>
-        <w:t>            "</w:t>
-      </w:r>
-      <w:proofErr w:type="spellStart"/>
-      <w:r>
-        <w:t>assigned_name</w:t>
-      </w:r>
-      <w:proofErr w:type="spellEnd"/>
-      <w:r>
-        <w:t>": "02-2248",</w:t>
+        <w:t>            "tt_no": "2026072129719",</w:t>
+      </w:r>
+    </w:p>
+    <w:p>
+      <w:r>
+        <w:t>            "employee_id": "02-2052",</w:t>
+      </w:r>
+    </w:p>
+    <w:p>
+      <w:r>
+        <w:t>            "employee_name": "Saumitro Kumer Sarder",</w:t>
+      </w:r>
+    </w:p>
+    <w:p>
+      <w:r>
+        <w:t>            "assigned_id": "",</w:t>
+      </w:r>
+    </w:p>
+    <w:p>
+      <w:r>
+        <w:t>            "assigned_name": "02-2248",</w:t>
       </w:r>
     </w:p>
     <w:p>
@@ -2647,15 +1833,7 @@
     </w:p>
     <w:p>
       <w:r>
-        <w:t>            "</w:t>
-      </w:r>
-      <w:proofErr w:type="spellStart"/>
-      <w:r>
-        <w:t>requisition_type</w:t>
-      </w:r>
-      <w:proofErr w:type="spellEnd"/>
-      <w:r>
-        <w:t>": "Petty Cash (Approved)",</w:t>
+        <w:t>            "requisition_type": "Petty Cash (Approved)",</w:t>
       </w:r>
     </w:p>
     <w:p>
@@ -2665,80 +1843,32 @@
     </w:p>
     <w:p>
       <w:r>
-        <w:t>            "</w:t>
-      </w:r>
-      <w:proofErr w:type="spellStart"/>
-      <w:r>
-        <w:t>dept_name</w:t>
-      </w:r>
-      <w:proofErr w:type="spellEnd"/>
-      <w:r>
-        <w:t>": "Technology and Operations",</w:t>
-      </w:r>
-    </w:p>
-    <w:p>
-      <w:r>
-        <w:t>            "</w:t>
-      </w:r>
-      <w:proofErr w:type="spellStart"/>
-      <w:r>
-        <w:t>func_name</w:t>
-      </w:r>
-      <w:proofErr w:type="spellEnd"/>
-      <w:r>
-        <w:t>": "IT",</w:t>
-      </w:r>
-    </w:p>
-    <w:p>
-      <w:r>
-        <w:t>            "</w:t>
-      </w:r>
-      <w:proofErr w:type="spellStart"/>
-      <w:r>
-        <w:t>delivered_status</w:t>
-      </w:r>
-      <w:proofErr w:type="spellEnd"/>
-      <w:r>
-        <w:t>": "Pending",</w:t>
-      </w:r>
-    </w:p>
-    <w:p>
-      <w:r>
-        <w:t>            "</w:t>
-      </w:r>
-      <w:proofErr w:type="spellStart"/>
-      <w:r>
-        <w:t>created_at</w:t>
-      </w:r>
-      <w:proofErr w:type="spellEnd"/>
-      <w:r>
-        <w:t>": "2026-07-21 13:58:46+06",</w:t>
-      </w:r>
-    </w:p>
-    <w:p>
-      <w:r>
-        <w:t>            "</w:t>
-      </w:r>
-      <w:proofErr w:type="spellStart"/>
-      <w:r>
-        <w:t>age_seconds</w:t>
-      </w:r>
-      <w:proofErr w:type="spellEnd"/>
-      <w:r>
-        <w:t>": 178977,</w:t>
-      </w:r>
-    </w:p>
-    <w:p>
-      <w:r>
-        <w:t>            "</w:t>
-      </w:r>
-      <w:proofErr w:type="spellStart"/>
-      <w:r>
-        <w:t>mobile_no</w:t>
-      </w:r>
-      <w:proofErr w:type="spellEnd"/>
-      <w:r>
-        <w:t>": "01717502816"</w:t>
+        <w:t>            "dept_name": "Technology and Operations",</w:t>
+      </w:r>
+    </w:p>
+    <w:p>
+      <w:r>
+        <w:t>            "func_name": "IT",</w:t>
+      </w:r>
+    </w:p>
+    <w:p>
+      <w:r>
+        <w:t>            "delivered_status": "Pending",</w:t>
+      </w:r>
+    </w:p>
+    <w:p>
+      <w:r>
+        <w:t>            "created_at": "2026-07-21 13:58:46+06",</w:t>
+      </w:r>
+    </w:p>
+    <w:p>
+      <w:r>
+        <w:t>            "age_seconds": 178977,</w:t>
+      </w:r>
+    </w:p>
+    <w:p>
+      <w:r>
+        <w:t>            "mobile_no": "01717502816"</w:t>
       </w:r>
     </w:p>
     <w:p>
@@ -2759,15 +1889,7 @@
     </w:p>
     <w:p>
       <w:r>
-        <w:t>    "</w:t>
-      </w:r>
-      <w:proofErr w:type="spellStart"/>
-      <w:r>
-        <w:t>page_size</w:t>
-      </w:r>
-      <w:proofErr w:type="spellEnd"/>
-      <w:r>
-        <w:t>": 10,</w:t>
+        <w:t>    "page_size": 10,</w:t>
       </w:r>
     </w:p>
     <w:p>
@@ -2852,11 +1974,9 @@
       </w:r>
     </w:p>
     <w:p>
-      <w:proofErr w:type="spellStart"/>
       <w:r>
         <w:t>requisition_type</w:t>
       </w:r>
-      <w:proofErr w:type="spellEnd"/>
     </w:p>
     <w:p>
       <w:r>
@@ -2870,11 +1990,9 @@
     </w:p>
     <w:p/>
     <w:p>
-      <w:proofErr w:type="spellStart"/>
       <w:r>
         <w:t>delivered_status</w:t>
       </w:r>
-      <w:proofErr w:type="spellEnd"/>
     </w:p>
     <w:p>
       <w:r>
@@ -3359,51 +2477,9 @@
     <w:p/>
     <w:p/>
     <w:p>
-      <w:proofErr w:type="spellStart"/>
-      <w:r>
-        <w:t>tbl_trouble_input.device_requis_val</w:t>
-      </w:r>
-      <w:proofErr w:type="spellEnd"/>
-      <w:r>
-        <w:t xml:space="preserve"> → </w:t>
-      </w:r>
-      <w:proofErr w:type="spellStart"/>
-      <w:r>
-        <w:t>trouble_tickets.source_device_requisition</w:t>
-      </w:r>
-      <w:proofErr w:type="spellEnd"/>
-      <w:r>
-        <w:t xml:space="preserve"> </w:t>
-      </w:r>
-      <w:proofErr w:type="spellStart"/>
-      <w:r>
-        <w:t>tbl_tt_reason.approved_val</w:t>
-      </w:r>
-      <w:proofErr w:type="spellEnd"/>
-      <w:r>
-        <w:t xml:space="preserve"> / </w:t>
-      </w:r>
-      <w:proofErr w:type="spellStart"/>
-      <w:r>
-        <w:t>delivered_val</w:t>
-      </w:r>
-      <w:proofErr w:type="spellEnd"/>
-      <w:r>
-        <w:t xml:space="preserve"> → </w:t>
-      </w:r>
-      <w:proofErr w:type="spellStart"/>
-      <w:r>
-        <w:t>tt_reasons.approved_val</w:t>
-      </w:r>
-      <w:proofErr w:type="spellEnd"/>
-      <w:r>
-        <w:t xml:space="preserve"> / </w:t>
-      </w:r>
-      <w:proofErr w:type="spellStart"/>
-      <w:r>
-        <w:t>delivered_val</w:t>
-      </w:r>
-      <w:proofErr w:type="spellEnd"/>
+      <w:r>
+        <w:t>tbl_trouble_input.device_requis_val → trouble_tickets.source_device_requisition tbl_tt_reason.approved_val / delivered_val → tt_reasons.approved_val / delivered_val</w:t>
+      </w:r>
     </w:p>
     <w:p/>
     <w:p/>
@@ -3424,23 +2500,7 @@
           <w:b/>
           <w:bCs/>
         </w:rPr>
-        <w:t xml:space="preserve">95 Trouble Tickets with </w:t>
-      </w:r>
-      <w:proofErr w:type="spellStart"/>
-      <w:r>
-        <w:rPr>
-          <w:b/>
-          <w:bCs/>
-        </w:rPr>
-        <w:t>source_device_requisition</w:t>
-      </w:r>
-      <w:proofErr w:type="spellEnd"/>
-      <w:r>
-        <w:rPr>
-          <w:b/>
-          <w:bCs/>
-        </w:rPr>
-        <w:t xml:space="preserve"> = 3</w:t>
+        <w:t>95 Trouble Tickets with source_device_requisition = 3</w:t>
       </w:r>
       <w:r>
         <w:t>. That means we can now move to the display mapping.</w:t>
@@ -3452,13 +2512,8 @@
       </w:r>
     </w:p>
     <w:p>
-      <w:proofErr w:type="spellStart"/>
-      <w:r>
-        <w:t>source_device_requisition</w:t>
-      </w:r>
-      <w:proofErr w:type="spellEnd"/>
-      <w:r>
-        <w:t xml:space="preserve"> = 3</w:t>
+      <w:r>
+        <w:t>source_device_requisition = 3</w:t>
       </w:r>
     </w:p>
     <w:p>
@@ -3468,13 +2523,8 @@
     </w:p>
     <w:p/>
     <w:p>
-      <w:proofErr w:type="spellStart"/>
-      <w:r>
-        <w:t>delivered_val</w:t>
-      </w:r>
-      <w:proofErr w:type="spellEnd"/>
-      <w:r>
-        <w:t xml:space="preserve"> = 0</w:t>
+      <w:r>
+        <w:t>delivered_val = 0</w:t>
       </w:r>
     </w:p>
     <w:p>
@@ -3484,13 +2534,8 @@
     </w:p>
     <w:p/>
     <w:p>
-      <w:proofErr w:type="spellStart"/>
-      <w:r>
-        <w:t>delivered_val</w:t>
-      </w:r>
-      <w:proofErr w:type="spellEnd"/>
-      <w:r>
-        <w:t xml:space="preserve"> = 1</w:t>
+      <w:r>
+        <w:t>delivered_val = 1</w:t>
       </w:r>
     </w:p>
     <w:p>
@@ -3500,13 +2545,8 @@
     </w:p>
     <w:p/>
     <w:p>
-      <w:proofErr w:type="spellStart"/>
-      <w:r>
-        <w:t>delivered_val</w:t>
-      </w:r>
-      <w:proofErr w:type="spellEnd"/>
-      <w:r>
-        <w:t xml:space="preserve"> = 2</w:t>
+      <w:r>
+        <w:t>delivered_val = 2</w:t>
       </w:r>
     </w:p>
     <w:p>
@@ -3516,13 +2556,8 @@
     </w:p>
     <w:p/>
     <w:p>
-      <w:proofErr w:type="spellStart"/>
-      <w:r>
-        <w:t>source_device_requisition</w:t>
-      </w:r>
-      <w:proofErr w:type="spellEnd"/>
-      <w:r>
-        <w:t xml:space="preserve"> = 3 + no delivery record</w:t>
+      <w:r>
+        <w:t>source_device_requisition = 3 + no delivery record</w:t>
       </w:r>
     </w:p>
     <w:p>
@@ -3551,48 +2586,22 @@
     </w:p>
     <w:p>
       <w:r>
-        <w:t xml:space="preserve">    </w:t>
-      </w:r>
-      <w:proofErr w:type="spellStart"/>
-      <w:r>
-        <w:t>tt_no</w:t>
-      </w:r>
-      <w:proofErr w:type="spellEnd"/>
-      <w:r>
-        <w:t>,</w:t>
-      </w:r>
-    </w:p>
-    <w:p>
-      <w:r>
-        <w:t xml:space="preserve">    </w:t>
-      </w:r>
-      <w:proofErr w:type="spellStart"/>
-      <w:r>
-        <w:t>source_device_requisition</w:t>
-      </w:r>
-      <w:proofErr w:type="spellEnd"/>
-    </w:p>
-    <w:p>
-      <w:r>
-        <w:t xml:space="preserve">FROM </w:t>
-      </w:r>
-      <w:proofErr w:type="spellStart"/>
-      <w:r>
-        <w:t>public.trouble_tickets</w:t>
-      </w:r>
-      <w:proofErr w:type="spellEnd"/>
-    </w:p>
-    <w:p>
-      <w:r>
-        <w:t>WHERE BTRIM(</w:t>
-      </w:r>
-      <w:proofErr w:type="spellStart"/>
-      <w:r>
-        <w:t>tt_no</w:t>
-      </w:r>
-      <w:proofErr w:type="spellEnd"/>
-      <w:r>
-        <w:t>) = '2026072629746';</w:t>
+        <w:t xml:space="preserve">    tt_no,</w:t>
+      </w:r>
+    </w:p>
+    <w:p>
+      <w:r>
+        <w:t xml:space="preserve">    source_device_requisition</w:t>
+      </w:r>
+    </w:p>
+    <w:p>
+      <w:r>
+        <w:t>FROM public.trouble_tickets</w:t>
+      </w:r>
+    </w:p>
+    <w:p>
+      <w:r>
+        <w:t>WHERE BTRIM(tt_no) = '2026072629746';</w:t>
       </w:r>
     </w:p>
     <w:p/>
@@ -3655,121 +2664,47 @@
     </w:p>
     <w:p>
       <w:r>
-        <w:t xml:space="preserve">    </w:t>
-      </w:r>
-      <w:proofErr w:type="spellStart"/>
-      <w:r>
-        <w:t>column_name</w:t>
-      </w:r>
-      <w:proofErr w:type="spellEnd"/>
-      <w:r>
-        <w:t>,</w:t>
-      </w:r>
-    </w:p>
-    <w:p>
-      <w:r>
-        <w:t xml:space="preserve">    </w:t>
-      </w:r>
-      <w:proofErr w:type="spellStart"/>
-      <w:r>
-        <w:t>data_type</w:t>
-      </w:r>
-      <w:proofErr w:type="spellEnd"/>
-    </w:p>
-    <w:p>
-      <w:r>
-        <w:t xml:space="preserve">FROM </w:t>
-      </w:r>
-      <w:proofErr w:type="spellStart"/>
-      <w:r>
-        <w:t>information_schema.columns</w:t>
-      </w:r>
-      <w:proofErr w:type="spellEnd"/>
-    </w:p>
-    <w:p>
-      <w:r>
-        <w:t xml:space="preserve">WHERE </w:t>
-      </w:r>
-      <w:proofErr w:type="spellStart"/>
-      <w:r>
-        <w:t>table_schema</w:t>
-      </w:r>
-      <w:proofErr w:type="spellEnd"/>
-      <w:r>
-        <w:t xml:space="preserve"> = 'public'</w:t>
-      </w:r>
-    </w:p>
-    <w:p>
-      <w:r>
-        <w:t xml:space="preserve">  AND </w:t>
-      </w:r>
-      <w:proofErr w:type="spellStart"/>
-      <w:r>
-        <w:t>table_name</w:t>
-      </w:r>
-      <w:proofErr w:type="spellEnd"/>
-      <w:r>
-        <w:t xml:space="preserve"> = '</w:t>
-      </w:r>
-      <w:proofErr w:type="spellStart"/>
-      <w:r>
-        <w:t>trouble_tickets</w:t>
-      </w:r>
-      <w:proofErr w:type="spellEnd"/>
-      <w:r>
-        <w:t>'</w:t>
-      </w:r>
-    </w:p>
-    <w:p>
-      <w:r>
-        <w:t xml:space="preserve">  AND </w:t>
-      </w:r>
-      <w:proofErr w:type="spellStart"/>
-      <w:r>
-        <w:t>column_name</w:t>
-      </w:r>
-      <w:proofErr w:type="spellEnd"/>
-      <w:r>
-        <w:t xml:space="preserve"> IN (</w:t>
-      </w:r>
-    </w:p>
-    <w:p>
-      <w:r>
-        <w:t xml:space="preserve">      '</w:t>
-      </w:r>
-      <w:proofErr w:type="spellStart"/>
-      <w:r>
-        <w:t>source_device_requisition</w:t>
-      </w:r>
-      <w:proofErr w:type="spellEnd"/>
-      <w:r>
-        <w:t>',</w:t>
-      </w:r>
-    </w:p>
-    <w:p>
-      <w:r>
-        <w:t xml:space="preserve">      '</w:t>
-      </w:r>
-      <w:proofErr w:type="spellStart"/>
-      <w:r>
-        <w:t>source_requisition_by</w:t>
-      </w:r>
-      <w:proofErr w:type="spellEnd"/>
-      <w:r>
-        <w:t>',</w:t>
-      </w:r>
-    </w:p>
-    <w:p>
-      <w:r>
-        <w:t xml:space="preserve">      '</w:t>
-      </w:r>
-      <w:proofErr w:type="spellStart"/>
-      <w:r>
-        <w:t>source_requisition_date</w:t>
-      </w:r>
-      <w:proofErr w:type="spellEnd"/>
-      <w:r>
-        <w:t>'</w:t>
+        <w:t xml:space="preserve">    column_name,</w:t>
+      </w:r>
+    </w:p>
+    <w:p>
+      <w:r>
+        <w:t xml:space="preserve">    data_type</w:t>
+      </w:r>
+    </w:p>
+    <w:p>
+      <w:r>
+        <w:t>FROM information_schema.columns</w:t>
+      </w:r>
+    </w:p>
+    <w:p>
+      <w:r>
+        <w:t>WHERE table_schema = 'public'</w:t>
+      </w:r>
+    </w:p>
+    <w:p>
+      <w:r>
+        <w:t xml:space="preserve">  AND table_name = 'trouble_tickets'</w:t>
+      </w:r>
+    </w:p>
+    <w:p>
+      <w:r>
+        <w:t xml:space="preserve">  AND column_name IN (</w:t>
+      </w:r>
+    </w:p>
+    <w:p>
+      <w:r>
+        <w:t xml:space="preserve">      'source_device_requisition',</w:t>
+      </w:r>
+    </w:p>
+    <w:p>
+      <w:r>
+        <w:t xml:space="preserve">      'source_requisition_by',</w:t>
+      </w:r>
+    </w:p>
+    <w:p>
+      <w:r>
+        <w:t xml:space="preserve">      'source_requisition_date'</w:t>
       </w:r>
     </w:p>
     <w:p>
@@ -3884,26 +2819,13 @@
     </w:p>
     <w:p/>
     <w:p>
-      <w:proofErr w:type="spellStart"/>
-      <w:r>
-        <w:t>source_device_requisition</w:t>
-      </w:r>
-      <w:proofErr w:type="spellEnd"/>
-      <w:r>
-        <w:t xml:space="preserve"> = 3</w:t>
-      </w:r>
-    </w:p>
-    <w:p>
-      <w:r>
-        <w:t xml:space="preserve">+ </w:t>
-      </w:r>
-      <w:proofErr w:type="spellStart"/>
-      <w:r>
-        <w:t>approved_val</w:t>
-      </w:r>
-      <w:proofErr w:type="spellEnd"/>
-      <w:r>
-        <w:t xml:space="preserve"> = NULL/0</w:t>
+      <w:r>
+        <w:t>source_device_requisition = 3</w:t>
+      </w:r>
+    </w:p>
+    <w:p>
+      <w:r>
+        <w:t>+ approved_val = NULL/0</w:t>
       </w:r>
     </w:p>
     <w:p>
@@ -3918,13 +2840,8 @@
     </w:p>
     <w:p/>
     <w:p>
-      <w:proofErr w:type="spellStart"/>
-      <w:r>
-        <w:t>approved_val</w:t>
-      </w:r>
-      <w:proofErr w:type="spellEnd"/>
-      <w:r>
-        <w:t xml:space="preserve"> = 1</w:t>
+      <w:r>
+        <w:t>approved_val = 1</w:t>
       </w:r>
     </w:p>
     <w:p>
@@ -3934,13 +2851,8 @@
     </w:p>
     <w:p/>
     <w:p>
-      <w:proofErr w:type="spellStart"/>
-      <w:r>
-        <w:t>approved_val</w:t>
-      </w:r>
-      <w:proofErr w:type="spellEnd"/>
-      <w:r>
-        <w:t xml:space="preserve"> = 3</w:t>
+      <w:r>
+        <w:t>approved_val = 3</w:t>
       </w:r>
     </w:p>
     <w:p>
@@ -3950,13 +2862,8 @@
     </w:p>
     <w:p/>
     <w:p>
-      <w:proofErr w:type="spellStart"/>
-      <w:r>
-        <w:t>approved_val</w:t>
-      </w:r>
-      <w:proofErr w:type="spellEnd"/>
-      <w:r>
-        <w:t xml:space="preserve"> = 2</w:t>
+      <w:r>
+        <w:t>approved_val = 2</w:t>
       </w:r>
     </w:p>
     <w:p>
@@ -3966,13 +2873,8 @@
     </w:p>
     <w:p/>
     <w:p>
-      <w:proofErr w:type="spellStart"/>
-      <w:r>
-        <w:t>delivered_val</w:t>
-      </w:r>
-      <w:proofErr w:type="spellEnd"/>
-      <w:r>
-        <w:t xml:space="preserve"> = 0</w:t>
+      <w:r>
+        <w:t>delivered_val = 0</w:t>
       </w:r>
     </w:p>
     <w:p>
@@ -3982,13 +2884,8 @@
     </w:p>
     <w:p/>
     <w:p>
-      <w:proofErr w:type="spellStart"/>
-      <w:r>
-        <w:t>delivered_val</w:t>
-      </w:r>
-      <w:proofErr w:type="spellEnd"/>
-      <w:r>
-        <w:t xml:space="preserve"> = 1</w:t>
+      <w:r>
+        <w:t>delivered_val = 1</w:t>
       </w:r>
     </w:p>
     <w:p>
@@ -3998,18 +2895,56 @@
     </w:p>
     <w:p/>
     <w:p>
-      <w:proofErr w:type="spellStart"/>
-      <w:r>
-        <w:t>delivered_val</w:t>
-      </w:r>
-      <w:proofErr w:type="spellEnd"/>
-      <w:r>
-        <w:t xml:space="preserve"> = 2</w:t>
+      <w:r>
+        <w:t>delivered_val = 2</w:t>
       </w:r>
     </w:p>
     <w:p>
       <w:r>
         <w:t>→ Rejected</w:t>
+      </w:r>
+    </w:p>
+    <w:p/>
+    <w:p/>
+    <w:p/>
+    <w:p/>
+    <w:p>
+      <w:r>
+        <w:drawing>
+          <wp:inline distT="0" distB="0" distL="0" distR="0" wp14:anchorId="10D2908A" wp14:editId="6C1D81E0">
+            <wp:extent cx="5943600" cy="2834005"/>
+            <wp:effectExtent l="0" t="0" r="0" b="4445"/>
+            <wp:docPr id="259751667" name="Picture 1"/>
+            <wp:cNvGraphicFramePr>
+              <a:graphicFrameLocks xmlns:a="http://schemas.openxmlformats.org/drawingml/2006/main" noChangeAspect="1"/>
+            </wp:cNvGraphicFramePr>
+            <a:graphic xmlns:a="http://schemas.openxmlformats.org/drawingml/2006/main">
+              <a:graphicData uri="http://schemas.openxmlformats.org/drawingml/2006/picture">
+                <pic:pic xmlns:pic="http://schemas.openxmlformats.org/drawingml/2006/picture">
+                  <pic:nvPicPr>
+                    <pic:cNvPr id="259751667" name=""/>
+                    <pic:cNvPicPr/>
+                  </pic:nvPicPr>
+                  <pic:blipFill>
+                    <a:blip r:embed="rId23"/>
+                    <a:stretch>
+                      <a:fillRect/>
+                    </a:stretch>
+                  </pic:blipFill>
+                  <pic:spPr>
+                    <a:xfrm>
+                      <a:off x="0" y="0"/>
+                      <a:ext cx="5943600" cy="2834005"/>
+                    </a:xfrm>
+                    <a:prstGeom prst="rect">
+                      <a:avLst/>
+                    </a:prstGeom>
+                  </pic:spPr>
+                </pic:pic>
+              </a:graphicData>
+            </a:graphic>
+          </wp:inline>
+        </w:drawing>
       </w:r>
     </w:p>
     <w:sectPr>

</xml_diff>